<commit_message>
chore : màj cdc
</commit_message>
<xml_diff>
--- a/P_App_Webstore.docx
+++ b/P_App_Webstore.docx
@@ -1,6 +1,6 @@
 
 <file path=word/document.xml><?xml version="1.0" encoding="utf-8"?>
-<w:document xmlns:wpc="http://schemas.microsoft.com/office/word/2010/wordprocessingCanvas" xmlns:cx="http://schemas.microsoft.com/office/drawing/2014/chartex" xmlns:cx1="http://schemas.microsoft.com/office/drawing/2015/9/8/chartex" xmlns:cx2="http://schemas.microsoft.com/office/drawing/2015/10/21/chartex" xmlns:cx3="http://schemas.microsoft.com/office/drawing/2016/5/9/chartex" xmlns:cx4="http://schemas.microsoft.com/office/drawing/2016/5/10/chartex" xmlns:cx5="http://schemas.microsoft.com/office/drawing/2016/5/11/chartex" xmlns:cx6="http://schemas.microsoft.com/office/drawing/2016/5/12/chartex" xmlns:cx7="http://schemas.microsoft.com/office/drawing/2016/5/13/chartex" xmlns:cx8="http://schemas.microsoft.com/office/drawing/2016/5/14/chartex" xmlns:mc="http://schemas.openxmlformats.org/markup-compatibility/2006" xmlns:aink="http://schemas.microsoft.com/office/drawing/2016/ink" xmlns:am3d="http://schemas.microsoft.com/office/drawing/2017/model3d" xmlns:o="urn:schemas-microsoft-com:office:office" xmlns:oel="http://schemas.microsoft.com/office/2019/extlst" xmlns:r="http://schemas.openxmlformats.org/officeDocument/2006/relationships" xmlns:m="http://schemas.openxmlformats.org/officeDocument/2006/math" xmlns:v="urn:schemas-microsoft-com:vml" xmlns:wp14="http://schemas.microsoft.com/office/word/2010/wordprocessingDrawing" xmlns:wp="http://schemas.openxmlformats.org/drawingml/2006/wordprocessingDrawing" xmlns:w10="urn:schemas-microsoft-com:office:word" xmlns:w="http://schemas.openxmlformats.org/wordprocessingml/2006/main" xmlns:w14="http://schemas.microsoft.com/office/word/2010/wordml" xmlns:w15="http://schemas.microsoft.com/office/word/2012/wordml" xmlns:w16cex="http://schemas.microsoft.com/office/word/2018/wordml/cex" xmlns:w16cid="http://schemas.microsoft.com/office/word/2016/wordml/cid" xmlns:w16="http://schemas.microsoft.com/office/word/2018/wordml" xmlns:w16du="http://schemas.microsoft.com/office/word/2023/wordml/word16du" xmlns:w16sdtdh="http://schemas.microsoft.com/office/word/2020/wordml/sdtdatahash" xmlns:w16sdtfl="http://schemas.microsoft.com/office/word/2024/wordml/sdtformatlock" xmlns:w16se="http://schemas.microsoft.com/office/word/2015/wordml/symex" xmlns:wpg="http://schemas.microsoft.com/office/word/2010/wordprocessingGroup" xmlns:wpi="http://schemas.microsoft.com/office/word/2010/wordprocessingInk" xmlns:wne="http://schemas.microsoft.com/office/word/2006/wordml" xmlns:wps="http://schemas.microsoft.com/office/word/2010/wordprocessingShape" mc:Ignorable="w14 w15 w16se w16cid w16 w16cex w16sdtdh w16sdtfl w16du wp14">
+<w:document xmlns:wpc="http://schemas.microsoft.com/office/word/2010/wordprocessingCanvas" xmlns:cx="http://schemas.microsoft.com/office/drawing/2014/chartex" xmlns:cx1="http://schemas.microsoft.com/office/drawing/2015/9/8/chartex" xmlns:cx2="http://schemas.microsoft.com/office/drawing/2015/10/21/chartex" xmlns:cx3="http://schemas.microsoft.com/office/drawing/2016/5/9/chartex" xmlns:cx4="http://schemas.microsoft.com/office/drawing/2016/5/10/chartex" xmlns:cx5="http://schemas.microsoft.com/office/drawing/2016/5/11/chartex" xmlns:cx6="http://schemas.microsoft.com/office/drawing/2016/5/12/chartex" xmlns:cx7="http://schemas.microsoft.com/office/drawing/2016/5/13/chartex" xmlns:cx8="http://schemas.microsoft.com/office/drawing/2016/5/14/chartex" xmlns:mc="http://schemas.openxmlformats.org/markup-compatibility/2006" xmlns:aink="http://schemas.microsoft.com/office/drawing/2016/ink" xmlns:am3d="http://schemas.microsoft.com/office/drawing/2017/model3d" xmlns:o="urn:schemas-microsoft-com:office:office" xmlns:oel="http://schemas.microsoft.com/office/2019/extlst" xmlns:r="http://schemas.openxmlformats.org/officeDocument/2006/relationships" xmlns:m="http://schemas.openxmlformats.org/officeDocument/2006/math" xmlns:v="urn:schemas-microsoft-com:vml" xmlns:wp14="http://schemas.microsoft.com/office/word/2010/wordprocessingDrawing" xmlns:wp="http://schemas.openxmlformats.org/drawingml/2006/wordprocessingDrawing" xmlns:w10="urn:schemas-microsoft-com:office:word" xmlns:w="http://schemas.openxmlformats.org/wordprocessingml/2006/main" xmlns:w14="http://schemas.microsoft.com/office/word/2010/wordml" xmlns:w15="http://schemas.microsoft.com/office/word/2012/wordml" xmlns:w16cex="http://schemas.microsoft.com/office/word/2018/wordml/cex" xmlns:w16cid="http://schemas.microsoft.com/office/word/2016/wordml/cid" xmlns:w16="http://schemas.microsoft.com/office/word/2018/wordml" xmlns:w16sdtdh="http://schemas.microsoft.com/office/word/2020/wordml/sdtdatahash" xmlns:w16se="http://schemas.microsoft.com/office/word/2015/wordml/symex" xmlns:wpg="http://schemas.microsoft.com/office/word/2010/wordprocessingGroup" xmlns:wpi="http://schemas.microsoft.com/office/word/2010/wordprocessingInk" xmlns:wne="http://schemas.microsoft.com/office/word/2006/wordml" xmlns:wps="http://schemas.microsoft.com/office/word/2010/wordprocessingShape" mc:Ignorable="w14 w15 w16se w16cid w16 w16cex w16sdtdh wp14">
   <w:body>
     <w:p>
       <w:pPr>
@@ -21,12 +21,12 @@
         <w:tblW w:w="9628" w:type="dxa"/>
         <w:jc w:val="center"/>
         <w:tblBorders>
-          <w:top w:val="single" w:color="auto" w:sz="4" w:space="0"/>
-          <w:left w:val="single" w:color="auto" w:sz="4" w:space="0"/>
-          <w:bottom w:val="single" w:color="auto" w:sz="4" w:space="0"/>
-          <w:right w:val="single" w:color="auto" w:sz="4" w:space="0"/>
-          <w:insideH w:val="single" w:color="auto" w:sz="4" w:space="0"/>
-          <w:insideV w:val="single" w:color="auto" w:sz="4" w:space="0"/>
+          <w:top w:val="single" w:sz="4" w:space="0" w:color="auto"/>
+          <w:left w:val="single" w:sz="4" w:space="0" w:color="auto"/>
+          <w:bottom w:val="single" w:sz="4" w:space="0" w:color="auto"/>
+          <w:right w:val="single" w:sz="4" w:space="0" w:color="auto"/>
+          <w:insideH w:val="single" w:sz="4" w:space="0" w:color="auto"/>
+          <w:insideV w:val="single" w:sz="4" w:space="0" w:color="auto"/>
         </w:tblBorders>
         <w:tblLayout w:type="fixed"/>
         <w:tblLook w:val="01E0" w:firstRow="1" w:lastRow="1" w:firstColumn="1" w:lastColumn="1" w:noHBand="0" w:noVBand="0"/>
@@ -533,7 +533,7 @@
       <w:r>
         <w:t xml:space="preserve">Un dépôt GitHub </w:t>
       </w:r>
-      <w:hyperlink w:history="1" r:id="rId11">
+      <w:hyperlink r:id="rId11" w:history="1">
         <w:r>
           <w:rPr>
             <w:rStyle w:val="Lienhypertexte"/>
@@ -569,6 +569,7 @@
         <w:keepLines/>
       </w:pPr>
       <w:r>
+        <w:lastRenderedPageBreak/>
         <w:t>TRAVAIL A REALISER</w:t>
       </w:r>
     </w:p>
@@ -764,12 +765,14 @@
         </w:rPr>
         <w:t xml:space="preserve">Implémenter l’utilisation d’un </w:t>
       </w:r>
+      <w:proofErr w:type="spellStart"/>
       <w:r>
         <w:rPr>
           <w:highlight w:val="green"/>
         </w:rPr>
         <w:t>token</w:t>
       </w:r>
+      <w:proofErr w:type="spellEnd"/>
       <w:r>
         <w:rPr>
           <w:highlight w:val="green"/>
@@ -883,26 +886,80 @@
           <w:ilvl w:val="0"/>
           <w:numId w:val="14"/>
         </w:numPr>
-      </w:pPr>
-      <w:r>
-        <w:t xml:space="preserve">Limiter la durée du token JWT </w:t>
-      </w:r>
-      <w:r>
+        <w:rPr>
+          <w:highlight w:val="yellow"/>
+        </w:rPr>
+      </w:pPr>
+      <w:r>
+        <w:rPr>
+          <w:highlight w:val="yellow"/>
+        </w:rPr>
+        <w:t xml:space="preserve">Limiter la durée du </w:t>
+      </w:r>
+      <w:proofErr w:type="spellStart"/>
+      <w:r>
+        <w:rPr>
+          <w:highlight w:val="yellow"/>
+        </w:rPr>
+        <w:t>token</w:t>
+      </w:r>
+      <w:proofErr w:type="spellEnd"/>
+      <w:r>
+        <w:rPr>
+          <w:highlight w:val="yellow"/>
+        </w:rPr>
+        <w:t xml:space="preserve"> JWT </w:t>
+      </w:r>
+      <w:r>
+        <w:rPr>
+          <w:highlight w:val="yellow"/>
+        </w:rPr>
         <w:t>actuel et i</w:t>
       </w:r>
       <w:r>
+        <w:rPr>
+          <w:highlight w:val="yellow"/>
+        </w:rPr>
         <w:t xml:space="preserve">mplémenter un </w:t>
       </w:r>
-      <w:r>
-        <w:t>refresh token</w:t>
-      </w:r>
-      <w:r>
+      <w:proofErr w:type="spellStart"/>
+      <w:r>
+        <w:rPr>
+          <w:highlight w:val="yellow"/>
+        </w:rPr>
+        <w:t>refresh</w:t>
+      </w:r>
+      <w:proofErr w:type="spellEnd"/>
+      <w:r>
+        <w:rPr>
+          <w:highlight w:val="yellow"/>
+        </w:rPr>
+        <w:t xml:space="preserve"> </w:t>
+      </w:r>
+      <w:proofErr w:type="spellStart"/>
+      <w:r>
+        <w:rPr>
+          <w:highlight w:val="yellow"/>
+        </w:rPr>
+        <w:t>token</w:t>
+      </w:r>
+      <w:proofErr w:type="spellEnd"/>
+      <w:r>
+        <w:rPr>
+          <w:highlight w:val="yellow"/>
+        </w:rPr>
         <w:t xml:space="preserve"> pour rester connect</w:t>
       </w:r>
       <w:r>
+        <w:rPr>
+          <w:highlight w:val="yellow"/>
+        </w:rPr>
         <w:t>é</w:t>
       </w:r>
       <w:r>
+        <w:rPr>
+          <w:highlight w:val="yellow"/>
+        </w:rPr>
         <w:t xml:space="preserve"> sur une longue période</w:t>
       </w:r>
     </w:p>
@@ -913,8 +970,14 @@
           <w:ilvl w:val="0"/>
           <w:numId w:val="14"/>
         </w:numPr>
-      </w:pPr>
-      <w:r>
+        <w:rPr>
+          <w:highlight w:val="yellow"/>
+        </w:rPr>
+      </w:pPr>
+      <w:r>
+        <w:rPr>
+          <w:highlight w:val="yellow"/>
+        </w:rPr>
         <w:t>Effectuer un audit des dépendances NPM, corriger et documenter la correction</w:t>
       </w:r>
     </w:p>
@@ -925,12 +988,35 @@
           <w:ilvl w:val="0"/>
           <w:numId w:val="14"/>
         </w:numPr>
-      </w:pPr>
-      <w:r>
+        <w:rPr>
+          <w:highlight w:val="yellow"/>
+        </w:rPr>
+      </w:pPr>
+      <w:r>
+        <w:rPr>
+          <w:highlight w:val="yellow"/>
+        </w:rPr>
         <w:t>Vérifier la résistance de vo</w:t>
       </w:r>
       <w:r>
-        <w:t>s hash avec l’outil John The Ripper et aux rainbow tables, via un export de la BDD</w:t>
+        <w:rPr>
+          <w:highlight w:val="yellow"/>
+        </w:rPr>
+        <w:t xml:space="preserve">s hash avec l’outil John The Ripper et aux </w:t>
+      </w:r>
+      <w:proofErr w:type="spellStart"/>
+      <w:r>
+        <w:rPr>
+          <w:highlight w:val="yellow"/>
+        </w:rPr>
+        <w:t>rainbow</w:t>
+      </w:r>
+      <w:proofErr w:type="spellEnd"/>
+      <w:r>
+        <w:rPr>
+          <w:highlight w:val="yellow"/>
+        </w:rPr>
+        <w:t xml:space="preserve"> tables, via un export de la BDD</w:t>
       </w:r>
     </w:p>
     <w:p>
@@ -940,8 +1026,14 @@
           <w:ilvl w:val="0"/>
           <w:numId w:val="14"/>
         </w:numPr>
-      </w:pPr>
-      <w:r>
+        <w:rPr>
+          <w:highlight w:val="yellow"/>
+        </w:rPr>
+      </w:pPr>
+      <w:r>
+        <w:rPr>
+          <w:highlight w:val="yellow"/>
+        </w:rPr>
         <w:t>Gérer les exceptions afin de ne pas retourner trop d’information en cas d’erreur</w:t>
       </w:r>
     </w:p>
@@ -963,11 +1055,20 @@
           <w:ilvl w:val="0"/>
           <w:numId w:val="14"/>
         </w:numPr>
-      </w:pPr>
-      <w:r>
+        <w:rPr>
+          <w:highlight w:val="yellow"/>
+        </w:rPr>
+      </w:pPr>
+      <w:r>
+        <w:rPr>
+          <w:highlight w:val="yellow"/>
+        </w:rPr>
         <w:t>Limiter le nombre de tentatives de login (exemple : 5 essais par minute par IP)</w:t>
       </w:r>
       <w:r>
+        <w:rPr>
+          <w:highlight w:val="yellow"/>
+        </w:rPr>
         <w:t xml:space="preserve"> pour contrer le brute-force</w:t>
       </w:r>
     </w:p>
@@ -1007,10 +1108,7 @@
         <w:t>c</w:t>
       </w:r>
       <w:r>
-        <w:t>urité de votre applicatio</w:t>
-      </w:r>
-      <w:r>
-        <w:t>n</w:t>
+        <w:t>urité de votre application</w:t>
       </w:r>
       <w:r>
         <w:t>, lister les failles identifiées en les classant selon le top 10 2025 OWASP</w:t>
@@ -1049,8 +1147,13 @@
         <w:t xml:space="preserve">Protection XSS : identifier une faille XSS dans l’application et </w:t>
       </w:r>
       <w:r>
-        <w:t>faire en sorte de la corriger</w:t>
-      </w:r>
+        <w:t xml:space="preserve">faire en sorte de la </w:t>
+      </w:r>
+      <w:proofErr w:type="gramStart"/>
+      <w:r>
+        <w:t>corriger</w:t>
+      </w:r>
+      <w:proofErr w:type="gramEnd"/>
     </w:p>
     <w:p>
       <w:pPr>
@@ -1154,6 +1257,7 @@
         </w:numPr>
       </w:pPr>
       <w:r>
+        <w:lastRenderedPageBreak/>
         <w:t xml:space="preserve">Scanner l’application avec OWASP ZAP, récupérer le rapport de scan et corriger au moins </w:t>
       </w:r>
       <w:r>
@@ -1185,8 +1289,42 @@
         <w:pStyle w:val="Corpsdetexte"/>
       </w:pPr>
       <w:r>
-        <w:t>Votre code sera versionné sur Github et un .gitignore empêchera de versionner les binaires npm (dossiers node_modules</w:t>
-      </w:r>
+        <w:t xml:space="preserve">Votre code sera versionné sur </w:t>
+      </w:r>
+      <w:proofErr w:type="spellStart"/>
+      <w:r>
+        <w:t>Github</w:t>
+      </w:r>
+      <w:proofErr w:type="spellEnd"/>
+      <w:r>
+        <w:t xml:space="preserve"> et </w:t>
+      </w:r>
+      <w:proofErr w:type="gramStart"/>
+      <w:r>
+        <w:t>un .</w:t>
+      </w:r>
+      <w:proofErr w:type="spellStart"/>
+      <w:r>
+        <w:t>gitignore</w:t>
+      </w:r>
+      <w:proofErr w:type="spellEnd"/>
+      <w:proofErr w:type="gramEnd"/>
+      <w:r>
+        <w:t xml:space="preserve"> empêchera de versionner les binaires </w:t>
+      </w:r>
+      <w:proofErr w:type="spellStart"/>
+      <w:r>
+        <w:t>npm</w:t>
+      </w:r>
+      <w:proofErr w:type="spellEnd"/>
+      <w:r>
+        <w:t xml:space="preserve"> (dossiers </w:t>
+      </w:r>
+      <w:proofErr w:type="spellStart"/>
+      <w:r>
+        <w:t>node_modules</w:t>
+      </w:r>
+      <w:proofErr w:type="spellEnd"/>
       <w:r>
         <w:t>)</w:t>
       </w:r>
@@ -1194,10 +1332,7 @@
         <w:t xml:space="preserve"> ainsi que les données sensibles contenues dans le fichier env</w:t>
       </w:r>
       <w:r>
-        <w:t>.</w:t>
-      </w:r>
-      <w:r>
-        <w:t xml:space="preserve"> Votre dépôt sera partagé avec votre chef de projet.</w:t>
+        <w:t>. Votre dépôt sera partagé avec votre chef de projet.</w:t>
       </w:r>
     </w:p>
     <w:p>
@@ -1216,9 +1351,11 @@
           <w:numId w:val="4"/>
         </w:numPr>
       </w:pPr>
+      <w:proofErr w:type="spellStart"/>
       <w:r>
         <w:t>GitJournal</w:t>
       </w:r>
+      <w:proofErr w:type="spellEnd"/>
     </w:p>
     <w:p>
       <w:pPr>
@@ -1297,7 +1434,21 @@
         <w:rPr>
           <w:lang w:val="fr-CH"/>
         </w:rPr>
-        <w:t>Release sur github v1.0.0 contenant</w:t>
+        <w:t xml:space="preserve">Release sur </w:t>
+      </w:r>
+      <w:proofErr w:type="spellStart"/>
+      <w:r>
+        <w:rPr>
+          <w:lang w:val="fr-CH"/>
+        </w:rPr>
+        <w:t>github</w:t>
+      </w:r>
+      <w:proofErr w:type="spellEnd"/>
+      <w:r>
+        <w:rPr>
+          <w:lang w:val="fr-CH"/>
+        </w:rPr>
+        <w:t xml:space="preserve"> v1.0.0 contenant</w:t>
       </w:r>
     </w:p>
     <w:p>
@@ -1355,12 +1506,12 @@
         <w:tblW w:w="5000" w:type="pct"/>
         <w:jc w:val="center"/>
         <w:tblBorders>
-          <w:top w:val="single" w:color="auto" w:sz="4" w:space="0"/>
-          <w:left w:val="single" w:color="auto" w:sz="4" w:space="0"/>
-          <w:bottom w:val="single" w:color="auto" w:sz="4" w:space="0"/>
-          <w:right w:val="single" w:color="auto" w:sz="4" w:space="0"/>
-          <w:insideH w:val="single" w:color="auto" w:sz="4" w:space="0"/>
-          <w:insideV w:val="single" w:color="auto" w:sz="4" w:space="0"/>
+          <w:top w:val="single" w:sz="4" w:space="0" w:color="auto"/>
+          <w:left w:val="single" w:sz="4" w:space="0" w:color="auto"/>
+          <w:bottom w:val="single" w:sz="4" w:space="0" w:color="auto"/>
+          <w:right w:val="single" w:sz="4" w:space="0" w:color="auto"/>
+          <w:insideH w:val="single" w:sz="4" w:space="0" w:color="auto"/>
+          <w:insideV w:val="single" w:sz="4" w:space="0" w:color="auto"/>
         </w:tblBorders>
         <w:tblLayout w:type="fixed"/>
         <w:tblCellMar>
@@ -1532,7 +1683,7 @@
       <w:footerReference w:type="default" r:id="rId13"/>
       <w:headerReference w:type="first" r:id="rId14"/>
       <w:footerReference w:type="first" r:id="rId15"/>
-      <w:pgSz w:w="11906" w:h="16838" w:orient="portrait" w:code="9"/>
+      <w:pgSz w:w="11906" w:h="16838" w:code="9"/>
       <w:pgMar w:top="1134" w:right="1134" w:bottom="1134" w:left="1134" w:header="340" w:footer="284" w:gutter="0"/>
       <w:cols w:space="720"/>
       <w:docGrid w:linePitch="299"/>
@@ -1542,7 +1693,7 @@
 </file>
 
 <file path=word/endnotes.xml><?xml version="1.0" encoding="utf-8"?>
-<w:endnotes xmlns:wpc="http://schemas.microsoft.com/office/word/2010/wordprocessingCanvas" xmlns:cx="http://schemas.microsoft.com/office/drawing/2014/chartex" xmlns:cx1="http://schemas.microsoft.com/office/drawing/2015/9/8/chartex" xmlns:cx2="http://schemas.microsoft.com/office/drawing/2015/10/21/chartex" xmlns:cx3="http://schemas.microsoft.com/office/drawing/2016/5/9/chartex" xmlns:cx4="http://schemas.microsoft.com/office/drawing/2016/5/10/chartex" xmlns:cx5="http://schemas.microsoft.com/office/drawing/2016/5/11/chartex" xmlns:cx6="http://schemas.microsoft.com/office/drawing/2016/5/12/chartex" xmlns:cx7="http://schemas.microsoft.com/office/drawing/2016/5/13/chartex" xmlns:cx8="http://schemas.microsoft.com/office/drawing/2016/5/14/chartex" xmlns:mc="http://schemas.openxmlformats.org/markup-compatibility/2006" xmlns:aink="http://schemas.microsoft.com/office/drawing/2016/ink" xmlns:am3d="http://schemas.microsoft.com/office/drawing/2017/model3d" xmlns:o="urn:schemas-microsoft-com:office:office" xmlns:oel="http://schemas.microsoft.com/office/2019/extlst" xmlns:r="http://schemas.openxmlformats.org/officeDocument/2006/relationships" xmlns:m="http://schemas.openxmlformats.org/officeDocument/2006/math" xmlns:v="urn:schemas-microsoft-com:vml" xmlns:wp14="http://schemas.microsoft.com/office/word/2010/wordprocessingDrawing" xmlns:wp="http://schemas.openxmlformats.org/drawingml/2006/wordprocessingDrawing" xmlns:w10="urn:schemas-microsoft-com:office:word" xmlns:w="http://schemas.openxmlformats.org/wordprocessingml/2006/main" xmlns:w14="http://schemas.microsoft.com/office/word/2010/wordml" xmlns:w15="http://schemas.microsoft.com/office/word/2012/wordml" xmlns:w16cex="http://schemas.microsoft.com/office/word/2018/wordml/cex" xmlns:w16cid="http://schemas.microsoft.com/office/word/2016/wordml/cid" xmlns:w16="http://schemas.microsoft.com/office/word/2018/wordml" xmlns:w16du="http://schemas.microsoft.com/office/word/2023/wordml/word16du" xmlns:w16sdtdh="http://schemas.microsoft.com/office/word/2020/wordml/sdtdatahash" xmlns:w16sdtfl="http://schemas.microsoft.com/office/word/2024/wordml/sdtformatlock" xmlns:w16se="http://schemas.microsoft.com/office/word/2015/wordml/symex" xmlns:wpg="http://schemas.microsoft.com/office/word/2010/wordprocessingGroup" xmlns:wpi="http://schemas.microsoft.com/office/word/2010/wordprocessingInk" xmlns:wne="http://schemas.microsoft.com/office/word/2006/wordml" xmlns:wps="http://schemas.microsoft.com/office/word/2010/wordprocessingShape" mc:Ignorable="w14 w15 w16se w16cid w16 w16cex w16sdtdh w16sdtfl w16du wp14">
+<w:endnotes xmlns:wpc="http://schemas.microsoft.com/office/word/2010/wordprocessingCanvas" xmlns:cx="http://schemas.microsoft.com/office/drawing/2014/chartex" xmlns:cx1="http://schemas.microsoft.com/office/drawing/2015/9/8/chartex" xmlns:cx2="http://schemas.microsoft.com/office/drawing/2015/10/21/chartex" xmlns:cx3="http://schemas.microsoft.com/office/drawing/2016/5/9/chartex" xmlns:cx4="http://schemas.microsoft.com/office/drawing/2016/5/10/chartex" xmlns:cx5="http://schemas.microsoft.com/office/drawing/2016/5/11/chartex" xmlns:cx6="http://schemas.microsoft.com/office/drawing/2016/5/12/chartex" xmlns:cx7="http://schemas.microsoft.com/office/drawing/2016/5/13/chartex" xmlns:cx8="http://schemas.microsoft.com/office/drawing/2016/5/14/chartex" xmlns:mc="http://schemas.openxmlformats.org/markup-compatibility/2006" xmlns:aink="http://schemas.microsoft.com/office/drawing/2016/ink" xmlns:am3d="http://schemas.microsoft.com/office/drawing/2017/model3d" xmlns:o="urn:schemas-microsoft-com:office:office" xmlns:oel="http://schemas.microsoft.com/office/2019/extlst" xmlns:r="http://schemas.openxmlformats.org/officeDocument/2006/relationships" xmlns:m="http://schemas.openxmlformats.org/officeDocument/2006/math" xmlns:v="urn:schemas-microsoft-com:vml" xmlns:wp14="http://schemas.microsoft.com/office/word/2010/wordprocessingDrawing" xmlns:wp="http://schemas.openxmlformats.org/drawingml/2006/wordprocessingDrawing" xmlns:w10="urn:schemas-microsoft-com:office:word" xmlns:w="http://schemas.openxmlformats.org/wordprocessingml/2006/main" xmlns:w14="http://schemas.microsoft.com/office/word/2010/wordml" xmlns:w15="http://schemas.microsoft.com/office/word/2012/wordml" xmlns:w16cex="http://schemas.microsoft.com/office/word/2018/wordml/cex" xmlns:w16cid="http://schemas.microsoft.com/office/word/2016/wordml/cid" xmlns:w16="http://schemas.microsoft.com/office/word/2018/wordml" xmlns:w16sdtdh="http://schemas.microsoft.com/office/word/2020/wordml/sdtdatahash" xmlns:w16se="http://schemas.microsoft.com/office/word/2015/wordml/symex" xmlns:wpg="http://schemas.microsoft.com/office/word/2010/wordprocessingGroup" xmlns:wpi="http://schemas.microsoft.com/office/word/2010/wordprocessingInk" xmlns:wne="http://schemas.microsoft.com/office/word/2006/wordml" xmlns:wps="http://schemas.microsoft.com/office/word/2010/wordprocessingShape" mc:Ignorable="w14 w15 w16se w16cid w16 w16cex w16sdtdh wp14">
   <w:endnote w:type="separator" w:id="-1">
     <w:p>
       <w:r>
@@ -1564,7 +1715,7 @@
 </file>
 
 <file path=word/footer1.xml><?xml version="1.0" encoding="utf-8"?>
-<w:ftr xmlns:wpc="http://schemas.microsoft.com/office/word/2010/wordprocessingCanvas" xmlns:cx="http://schemas.microsoft.com/office/drawing/2014/chartex" xmlns:cx1="http://schemas.microsoft.com/office/drawing/2015/9/8/chartex" xmlns:cx2="http://schemas.microsoft.com/office/drawing/2015/10/21/chartex" xmlns:cx3="http://schemas.microsoft.com/office/drawing/2016/5/9/chartex" xmlns:cx4="http://schemas.microsoft.com/office/drawing/2016/5/10/chartex" xmlns:cx5="http://schemas.microsoft.com/office/drawing/2016/5/11/chartex" xmlns:cx6="http://schemas.microsoft.com/office/drawing/2016/5/12/chartex" xmlns:cx7="http://schemas.microsoft.com/office/drawing/2016/5/13/chartex" xmlns:cx8="http://schemas.microsoft.com/office/drawing/2016/5/14/chartex" xmlns:mc="http://schemas.openxmlformats.org/markup-compatibility/2006" xmlns:aink="http://schemas.microsoft.com/office/drawing/2016/ink" xmlns:am3d="http://schemas.microsoft.com/office/drawing/2017/model3d" xmlns:o="urn:schemas-microsoft-com:office:office" xmlns:oel="http://schemas.microsoft.com/office/2019/extlst" xmlns:r="http://schemas.openxmlformats.org/officeDocument/2006/relationships" xmlns:m="http://schemas.openxmlformats.org/officeDocument/2006/math" xmlns:v="urn:schemas-microsoft-com:vml" xmlns:wp14="http://schemas.microsoft.com/office/word/2010/wordprocessingDrawing" xmlns:wp="http://schemas.openxmlformats.org/drawingml/2006/wordprocessingDrawing" xmlns:w10="urn:schemas-microsoft-com:office:word" xmlns:w="http://schemas.openxmlformats.org/wordprocessingml/2006/main" xmlns:w14="http://schemas.microsoft.com/office/word/2010/wordml" xmlns:w15="http://schemas.microsoft.com/office/word/2012/wordml" xmlns:w16cex="http://schemas.microsoft.com/office/word/2018/wordml/cex" xmlns:w16cid="http://schemas.microsoft.com/office/word/2016/wordml/cid" xmlns:w16="http://schemas.microsoft.com/office/word/2018/wordml" xmlns:w16du="http://schemas.microsoft.com/office/word/2023/wordml/word16du" xmlns:w16sdtdh="http://schemas.microsoft.com/office/word/2020/wordml/sdtdatahash" xmlns:w16sdtfl="http://schemas.microsoft.com/office/word/2024/wordml/sdtformatlock" xmlns:w16se="http://schemas.microsoft.com/office/word/2015/wordml/symex" xmlns:wpg="http://schemas.microsoft.com/office/word/2010/wordprocessingGroup" xmlns:wpi="http://schemas.microsoft.com/office/word/2010/wordprocessingInk" xmlns:wne="http://schemas.microsoft.com/office/word/2006/wordml" xmlns:wps="http://schemas.microsoft.com/office/word/2010/wordprocessingShape" mc:Ignorable="w14 w15 w16se w16cid w16 w16cex w16sdtdh w16sdtfl w16du wp14">
+<w:ftr xmlns:wpc="http://schemas.microsoft.com/office/word/2010/wordprocessingCanvas" xmlns:cx="http://schemas.microsoft.com/office/drawing/2014/chartex" xmlns:cx1="http://schemas.microsoft.com/office/drawing/2015/9/8/chartex" xmlns:cx2="http://schemas.microsoft.com/office/drawing/2015/10/21/chartex" xmlns:cx3="http://schemas.microsoft.com/office/drawing/2016/5/9/chartex" xmlns:cx4="http://schemas.microsoft.com/office/drawing/2016/5/10/chartex" xmlns:cx5="http://schemas.microsoft.com/office/drawing/2016/5/11/chartex" xmlns:cx6="http://schemas.microsoft.com/office/drawing/2016/5/12/chartex" xmlns:cx7="http://schemas.microsoft.com/office/drawing/2016/5/13/chartex" xmlns:cx8="http://schemas.microsoft.com/office/drawing/2016/5/14/chartex" xmlns:mc="http://schemas.openxmlformats.org/markup-compatibility/2006" xmlns:aink="http://schemas.microsoft.com/office/drawing/2016/ink" xmlns:am3d="http://schemas.microsoft.com/office/drawing/2017/model3d" xmlns:o="urn:schemas-microsoft-com:office:office" xmlns:oel="http://schemas.microsoft.com/office/2019/extlst" xmlns:r="http://schemas.openxmlformats.org/officeDocument/2006/relationships" xmlns:m="http://schemas.openxmlformats.org/officeDocument/2006/math" xmlns:v="urn:schemas-microsoft-com:vml" xmlns:wp14="http://schemas.microsoft.com/office/word/2010/wordprocessingDrawing" xmlns:wp="http://schemas.openxmlformats.org/drawingml/2006/wordprocessingDrawing" xmlns:w10="urn:schemas-microsoft-com:office:word" xmlns:w="http://schemas.openxmlformats.org/wordprocessingml/2006/main" xmlns:w14="http://schemas.microsoft.com/office/word/2010/wordml" xmlns:w15="http://schemas.microsoft.com/office/word/2012/wordml" xmlns:w16cex="http://schemas.microsoft.com/office/word/2018/wordml/cex" xmlns:w16cid="http://schemas.microsoft.com/office/word/2016/wordml/cid" xmlns:w16="http://schemas.microsoft.com/office/word/2018/wordml" xmlns:w16sdtdh="http://schemas.microsoft.com/office/word/2020/wordml/sdtdatahash" xmlns:w16se="http://schemas.microsoft.com/office/word/2015/wordml/symex" xmlns:wpg="http://schemas.microsoft.com/office/word/2010/wordprocessingGroup" xmlns:wpi="http://schemas.microsoft.com/office/word/2010/wordprocessingInk" xmlns:wne="http://schemas.microsoft.com/office/word/2006/wordml" xmlns:wps="http://schemas.microsoft.com/office/word/2010/wordprocessingShape" mc:Ignorable="w14 w15 w16se w16cid w16 w16cex w16sdtdh wp14">
   <w:p>
     <w:pPr>
       <w:pStyle w:val="Pieddepage"/>
@@ -1595,7 +1746,7 @@
       <w:tblW w:w="5000" w:type="pct"/>
       <w:jc w:val="center"/>
       <w:tblBorders>
-        <w:top w:val="single" w:color="auto" w:sz="12" w:space="0"/>
+        <w:top w:val="single" w:sz="12" w:space="0" w:color="auto"/>
       </w:tblBorders>
       <w:tblLook w:val="01E0" w:firstRow="1" w:lastRow="1" w:firstColumn="1" w:lastColumn="1" w:noHBand="0" w:noVBand="0"/>
     </w:tblPr>
@@ -1622,11 +1773,19 @@
               <w:lang w:val="de-CH"/>
             </w:rPr>
           </w:pPr>
+          <w:proofErr w:type="gramStart"/>
           <w:r>
             <w:rPr>
               <w:lang w:val="de-CH"/>
             </w:rPr>
-            <w:t xml:space="preserve">Fichier : </w:t>
+            <w:t>Fichier :</w:t>
+          </w:r>
+          <w:proofErr w:type="gramEnd"/>
+          <w:r>
+            <w:rPr>
+              <w:lang w:val="de-CH"/>
+            </w:rPr>
+            <w:t xml:space="preserve"> </w:t>
           </w:r>
           <w:r>
             <w:fldChar w:fldCharType="begin"/>
@@ -1674,45 +1833,25 @@
           <w:r>
             <w:t xml:space="preserve"> </w:t>
           </w:r>
-          <w:r>
-            <w:fldChar w:fldCharType="begin"/>
-          </w:r>
-          <w:r>
-            <w:instrText>REVNUM   \* MERGEFORMAT</w:instrText>
-          </w:r>
-          <w:r>
-            <w:fldChar w:fldCharType="separate"/>
-          </w:r>
-          <w:r>
-            <w:rPr>
-              <w:noProof/>
-            </w:rPr>
-            <w:t>1</w:t>
-          </w:r>
-          <w:r>
-            <w:fldChar w:fldCharType="end"/>
-          </w:r>
+          <w:fldSimple w:instr="REVNUM   \* MERGEFORMAT">
+            <w:r>
+              <w:rPr>
+                <w:noProof/>
+              </w:rPr>
+              <w:t>1</w:t>
+            </w:r>
+          </w:fldSimple>
           <w:r>
             <w:t xml:space="preserve"> du </w:t>
           </w:r>
-          <w:r>
-            <w:fldChar w:fldCharType="begin"/>
-          </w:r>
-          <w:r>
-            <w:instrText>CREATEDATE   \* MERGEFORMAT</w:instrText>
-          </w:r>
-          <w:r>
-            <w:fldChar w:fldCharType="separate"/>
-          </w:r>
-          <w:r>
-            <w:rPr>
-              <w:noProof/>
-            </w:rPr>
-            <w:t>11/01/2024 12:31:00</w:t>
-          </w:r>
-          <w:r>
-            <w:fldChar w:fldCharType="end"/>
-          </w:r>
+          <w:fldSimple w:instr="CREATEDATE   \* MERGEFORMAT">
+            <w:r>
+              <w:rPr>
+                <w:noProof/>
+              </w:rPr>
+              <w:t>11/01/2024 12:31:00</w:t>
+            </w:r>
+          </w:fldSimple>
           <w:r>
             <w:fldChar w:fldCharType="begin"/>
           </w:r>
@@ -1826,24 +1965,14 @@
           <w:r>
             <w:t xml:space="preserve">Dernière modification le </w:t>
           </w:r>
-          <w:r>
-            <w:fldChar w:fldCharType="begin"/>
-          </w:r>
-          <w:r>
-            <w:instrText>SAVEDATE   \* MERGEFORMAT</w:instrText>
-          </w:r>
-          <w:r>
-            <w:fldChar w:fldCharType="separate"/>
-          </w:r>
-          <w:r>
-            <w:rPr>
-              <w:noProof/>
-            </w:rPr>
-            <w:t>17/03/2026 09:57:00</w:t>
-          </w:r>
-          <w:r>
-            <w:fldChar w:fldCharType="end"/>
-          </w:r>
+          <w:fldSimple w:instr="SAVEDATE   \* MERGEFORMAT">
+            <w:r>
+              <w:rPr>
+                <w:noProof/>
+              </w:rPr>
+              <w:t>24/04/2026 12:09:00</w:t>
+            </w:r>
+          </w:fldSimple>
         </w:p>
       </w:tc>
     </w:tr>
@@ -1922,7 +2051,7 @@
             <w:rPr>
               <w:noProof/>
             </w:rPr>
-            <w:t>09:06</w:t>
+            <w:t>08:27</w:t>
           </w:r>
           <w:r>
             <w:fldChar w:fldCharType="end"/>
@@ -1951,7 +2080,7 @@
 </file>
 
 <file path=word/footer2.xml><?xml version="1.0" encoding="utf-8"?>
-<w:ftr xmlns:wpc="http://schemas.microsoft.com/office/word/2010/wordprocessingCanvas" xmlns:cx="http://schemas.microsoft.com/office/drawing/2014/chartex" xmlns:cx1="http://schemas.microsoft.com/office/drawing/2015/9/8/chartex" xmlns:cx2="http://schemas.microsoft.com/office/drawing/2015/10/21/chartex" xmlns:cx3="http://schemas.microsoft.com/office/drawing/2016/5/9/chartex" xmlns:cx4="http://schemas.microsoft.com/office/drawing/2016/5/10/chartex" xmlns:cx5="http://schemas.microsoft.com/office/drawing/2016/5/11/chartex" xmlns:cx6="http://schemas.microsoft.com/office/drawing/2016/5/12/chartex" xmlns:cx7="http://schemas.microsoft.com/office/drawing/2016/5/13/chartex" xmlns:cx8="http://schemas.microsoft.com/office/drawing/2016/5/14/chartex" xmlns:mc="http://schemas.openxmlformats.org/markup-compatibility/2006" xmlns:aink="http://schemas.microsoft.com/office/drawing/2016/ink" xmlns:am3d="http://schemas.microsoft.com/office/drawing/2017/model3d" xmlns:o="urn:schemas-microsoft-com:office:office" xmlns:oel="http://schemas.microsoft.com/office/2019/extlst" xmlns:r="http://schemas.openxmlformats.org/officeDocument/2006/relationships" xmlns:m="http://schemas.openxmlformats.org/officeDocument/2006/math" xmlns:v="urn:schemas-microsoft-com:vml" xmlns:wp14="http://schemas.microsoft.com/office/word/2010/wordprocessingDrawing" xmlns:wp="http://schemas.openxmlformats.org/drawingml/2006/wordprocessingDrawing" xmlns:w10="urn:schemas-microsoft-com:office:word" xmlns:w="http://schemas.openxmlformats.org/wordprocessingml/2006/main" xmlns:w14="http://schemas.microsoft.com/office/word/2010/wordml" xmlns:w15="http://schemas.microsoft.com/office/word/2012/wordml" xmlns:w16cex="http://schemas.microsoft.com/office/word/2018/wordml/cex" xmlns:w16cid="http://schemas.microsoft.com/office/word/2016/wordml/cid" xmlns:w16="http://schemas.microsoft.com/office/word/2018/wordml" xmlns:w16du="http://schemas.microsoft.com/office/word/2023/wordml/word16du" xmlns:w16sdtdh="http://schemas.microsoft.com/office/word/2020/wordml/sdtdatahash" xmlns:w16sdtfl="http://schemas.microsoft.com/office/word/2024/wordml/sdtformatlock" xmlns:w16se="http://schemas.microsoft.com/office/word/2015/wordml/symex" xmlns:wpg="http://schemas.microsoft.com/office/word/2010/wordprocessingGroup" xmlns:wpi="http://schemas.microsoft.com/office/word/2010/wordprocessingInk" xmlns:wne="http://schemas.microsoft.com/office/word/2006/wordml" xmlns:wps="http://schemas.microsoft.com/office/word/2010/wordprocessingShape" xmlns:a="http://schemas.openxmlformats.org/drawingml/2006/main" xmlns:a14="http://schemas.microsoft.com/office/drawing/2010/main" mc:Ignorable="w14 w15 w16se w16cid w16 w16cex w16sdtdh w16sdtfl w16du wp14">
+<w:ftr xmlns:wpc="http://schemas.microsoft.com/office/word/2010/wordprocessingCanvas" xmlns:cx="http://schemas.microsoft.com/office/drawing/2014/chartex" xmlns:cx1="http://schemas.microsoft.com/office/drawing/2015/9/8/chartex" xmlns:cx2="http://schemas.microsoft.com/office/drawing/2015/10/21/chartex" xmlns:cx3="http://schemas.microsoft.com/office/drawing/2016/5/9/chartex" xmlns:cx4="http://schemas.microsoft.com/office/drawing/2016/5/10/chartex" xmlns:cx5="http://schemas.microsoft.com/office/drawing/2016/5/11/chartex" xmlns:cx6="http://schemas.microsoft.com/office/drawing/2016/5/12/chartex" xmlns:cx7="http://schemas.microsoft.com/office/drawing/2016/5/13/chartex" xmlns:cx8="http://schemas.microsoft.com/office/drawing/2016/5/14/chartex" xmlns:mc="http://schemas.openxmlformats.org/markup-compatibility/2006" xmlns:aink="http://schemas.microsoft.com/office/drawing/2016/ink" xmlns:am3d="http://schemas.microsoft.com/office/drawing/2017/model3d" xmlns:o="urn:schemas-microsoft-com:office:office" xmlns:oel="http://schemas.microsoft.com/office/2019/extlst" xmlns:r="http://schemas.openxmlformats.org/officeDocument/2006/relationships" xmlns:m="http://schemas.openxmlformats.org/officeDocument/2006/math" xmlns:v="urn:schemas-microsoft-com:vml" xmlns:wp14="http://schemas.microsoft.com/office/word/2010/wordprocessingDrawing" xmlns:wp="http://schemas.openxmlformats.org/drawingml/2006/wordprocessingDrawing" xmlns:w10="urn:schemas-microsoft-com:office:word" xmlns:w="http://schemas.openxmlformats.org/wordprocessingml/2006/main" xmlns:w14="http://schemas.microsoft.com/office/word/2010/wordml" xmlns:w15="http://schemas.microsoft.com/office/word/2012/wordml" xmlns:w16cex="http://schemas.microsoft.com/office/word/2018/wordml/cex" xmlns:w16cid="http://schemas.microsoft.com/office/word/2016/wordml/cid" xmlns:w16="http://schemas.microsoft.com/office/word/2018/wordml" xmlns:w16sdtdh="http://schemas.microsoft.com/office/word/2020/wordml/sdtdatahash" xmlns:w16se="http://schemas.microsoft.com/office/word/2015/wordml/symex" xmlns:wpg="http://schemas.microsoft.com/office/word/2010/wordprocessingGroup" xmlns:wpi="http://schemas.microsoft.com/office/word/2010/wordprocessingInk" xmlns:wne="http://schemas.microsoft.com/office/word/2006/wordml" xmlns:wps="http://schemas.microsoft.com/office/word/2010/wordprocessingShape" mc:Ignorable="w14 w15 w16se w16cid w16 w16cex w16sdtdh wp14">
   <w:p>
     <w:pPr>
       <w:pStyle w:val="Pieddepage"/>
@@ -2029,7 +2158,7 @@
             </wp:anchor>
           </w:drawing>
         </mc:Choice>
-        <mc:Fallback xmlns:arto="http://schemas.microsoft.com/office/word/2006/arto" xmlns:a14="http://schemas.microsoft.com/office/drawing/2010/main" xmlns:a="http://schemas.openxmlformats.org/drawingml/2006/main">
+        <mc:Fallback xmlns:a="http://schemas.openxmlformats.org/drawingml/2006/main" xmlns:a14="http://schemas.microsoft.com/office/drawing/2010/main" xmlns:arto="http://schemas.microsoft.com/office/word/2006/arto" xmlns:w16sdtfl="http://schemas.microsoft.com/office/word/2024/wordml/sdtformatlock" xmlns:w16du="http://schemas.microsoft.com/office/word/2023/wordml/word16du">
           <w:pict w14:anchorId="0E5E3D4F">
             <v:line id="Line 2" style="position:absolute;z-index:251657728;visibility:visible;mso-wrap-style:square;mso-width-percent:0;mso-height-percent:0;mso-wrap-distance-left:9pt;mso-wrap-distance-top:0;mso-wrap-distance-right:9pt;mso-wrap-distance-bottom:0;mso-position-horizontal:absolute;mso-position-horizontal-relative:text;mso-position-vertical:absolute;mso-position-vertical-relative:text;mso-width-percent:0;mso-height-percent:0;mso-width-relative:page;mso-height-relative:page" o:spid="_x0000_s1026" from="-.5pt,-.1pt" to="496.35pt,-.1pt" w14:anchorId="115AFD38" o:gfxdata="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"/>
           </w:pict>
@@ -2106,13 +2235,6 @@
         <w:sz w:val="12"/>
       </w:rPr>
       <w:tab/>
-    </w:r>
-    <w:r>
-      <w:rPr>
-        <w:rFonts w:cs="Arial"/>
-        <w:snapToGrid w:val="0"/>
-        <w:sz w:val="12"/>
-      </w:rPr>
       <w:t>Version du 1.08.03</w:t>
     </w:r>
   </w:p>
@@ -2174,13 +2296,6 @@
         <w:sz w:val="12"/>
       </w:rPr>
       <w:tab/>
-    </w:r>
-    <w:r>
-      <w:rPr>
-        <w:rFonts w:cs="Arial"/>
-        <w:snapToGrid w:val="0"/>
-        <w:sz w:val="12"/>
-      </w:rPr>
       <w:t xml:space="preserve">Imprimé le </w:t>
     </w:r>
     <w:r>
@@ -2214,7 +2329,7 @@
         <w:snapToGrid w:val="0"/>
         <w:sz w:val="12"/>
       </w:rPr>
-      <w:t>18/03/2026</w:t>
+      <w:t>18/05/2026</w:t>
     </w:r>
     <w:r>
       <w:rPr>
@@ -2263,7 +2378,7 @@
         <w:snapToGrid w:val="0"/>
         <w:sz w:val="12"/>
       </w:rPr>
-      <w:t>09:06</w:t>
+      <w:t>08:27</w:t>
     </w:r>
     <w:r>
       <w:rPr>
@@ -2405,7 +2520,7 @@
 </file>
 
 <file path=word/footnotes.xml><?xml version="1.0" encoding="utf-8"?>
-<w:footnotes xmlns:wpc="http://schemas.microsoft.com/office/word/2010/wordprocessingCanvas" xmlns:cx="http://schemas.microsoft.com/office/drawing/2014/chartex" xmlns:cx1="http://schemas.microsoft.com/office/drawing/2015/9/8/chartex" xmlns:cx2="http://schemas.microsoft.com/office/drawing/2015/10/21/chartex" xmlns:cx3="http://schemas.microsoft.com/office/drawing/2016/5/9/chartex" xmlns:cx4="http://schemas.microsoft.com/office/drawing/2016/5/10/chartex" xmlns:cx5="http://schemas.microsoft.com/office/drawing/2016/5/11/chartex" xmlns:cx6="http://schemas.microsoft.com/office/drawing/2016/5/12/chartex" xmlns:cx7="http://schemas.microsoft.com/office/drawing/2016/5/13/chartex" xmlns:cx8="http://schemas.microsoft.com/office/drawing/2016/5/14/chartex" xmlns:mc="http://schemas.openxmlformats.org/markup-compatibility/2006" xmlns:aink="http://schemas.microsoft.com/office/drawing/2016/ink" xmlns:am3d="http://schemas.microsoft.com/office/drawing/2017/model3d" xmlns:o="urn:schemas-microsoft-com:office:office" xmlns:oel="http://schemas.microsoft.com/office/2019/extlst" xmlns:r="http://schemas.openxmlformats.org/officeDocument/2006/relationships" xmlns:m="http://schemas.openxmlformats.org/officeDocument/2006/math" xmlns:v="urn:schemas-microsoft-com:vml" xmlns:wp14="http://schemas.microsoft.com/office/word/2010/wordprocessingDrawing" xmlns:wp="http://schemas.openxmlformats.org/drawingml/2006/wordprocessingDrawing" xmlns:w10="urn:schemas-microsoft-com:office:word" xmlns:w="http://schemas.openxmlformats.org/wordprocessingml/2006/main" xmlns:w14="http://schemas.microsoft.com/office/word/2010/wordml" xmlns:w15="http://schemas.microsoft.com/office/word/2012/wordml" xmlns:w16cex="http://schemas.microsoft.com/office/word/2018/wordml/cex" xmlns:w16cid="http://schemas.microsoft.com/office/word/2016/wordml/cid" xmlns:w16="http://schemas.microsoft.com/office/word/2018/wordml" xmlns:w16du="http://schemas.microsoft.com/office/word/2023/wordml/word16du" xmlns:w16sdtdh="http://schemas.microsoft.com/office/word/2020/wordml/sdtdatahash" xmlns:w16sdtfl="http://schemas.microsoft.com/office/word/2024/wordml/sdtformatlock" xmlns:w16se="http://schemas.microsoft.com/office/word/2015/wordml/symex" xmlns:wpg="http://schemas.microsoft.com/office/word/2010/wordprocessingGroup" xmlns:wpi="http://schemas.microsoft.com/office/word/2010/wordprocessingInk" xmlns:wne="http://schemas.microsoft.com/office/word/2006/wordml" xmlns:wps="http://schemas.microsoft.com/office/word/2010/wordprocessingShape" mc:Ignorable="w14 w15 w16se w16cid w16 w16cex w16sdtdh w16sdtfl w16du wp14">
+<w:footnotes xmlns:wpc="http://schemas.microsoft.com/office/word/2010/wordprocessingCanvas" xmlns:cx="http://schemas.microsoft.com/office/drawing/2014/chartex" xmlns:cx1="http://schemas.microsoft.com/office/drawing/2015/9/8/chartex" xmlns:cx2="http://schemas.microsoft.com/office/drawing/2015/10/21/chartex" xmlns:cx3="http://schemas.microsoft.com/office/drawing/2016/5/9/chartex" xmlns:cx4="http://schemas.microsoft.com/office/drawing/2016/5/10/chartex" xmlns:cx5="http://schemas.microsoft.com/office/drawing/2016/5/11/chartex" xmlns:cx6="http://schemas.microsoft.com/office/drawing/2016/5/12/chartex" xmlns:cx7="http://schemas.microsoft.com/office/drawing/2016/5/13/chartex" xmlns:cx8="http://schemas.microsoft.com/office/drawing/2016/5/14/chartex" xmlns:mc="http://schemas.openxmlformats.org/markup-compatibility/2006" xmlns:aink="http://schemas.microsoft.com/office/drawing/2016/ink" xmlns:am3d="http://schemas.microsoft.com/office/drawing/2017/model3d" xmlns:o="urn:schemas-microsoft-com:office:office" xmlns:oel="http://schemas.microsoft.com/office/2019/extlst" xmlns:r="http://schemas.openxmlformats.org/officeDocument/2006/relationships" xmlns:m="http://schemas.openxmlformats.org/officeDocument/2006/math" xmlns:v="urn:schemas-microsoft-com:vml" xmlns:wp14="http://schemas.microsoft.com/office/word/2010/wordprocessingDrawing" xmlns:wp="http://schemas.openxmlformats.org/drawingml/2006/wordprocessingDrawing" xmlns:w10="urn:schemas-microsoft-com:office:word" xmlns:w="http://schemas.openxmlformats.org/wordprocessingml/2006/main" xmlns:w14="http://schemas.microsoft.com/office/word/2010/wordml" xmlns:w15="http://schemas.microsoft.com/office/word/2012/wordml" xmlns:w16cex="http://schemas.microsoft.com/office/word/2018/wordml/cex" xmlns:w16cid="http://schemas.microsoft.com/office/word/2016/wordml/cid" xmlns:w16="http://schemas.microsoft.com/office/word/2018/wordml" xmlns:w16sdtdh="http://schemas.microsoft.com/office/word/2020/wordml/sdtdatahash" xmlns:w16se="http://schemas.microsoft.com/office/word/2015/wordml/symex" xmlns:wpg="http://schemas.microsoft.com/office/word/2010/wordprocessingGroup" xmlns:wpi="http://schemas.microsoft.com/office/word/2010/wordprocessingInk" xmlns:wne="http://schemas.microsoft.com/office/word/2006/wordml" xmlns:wps="http://schemas.microsoft.com/office/word/2010/wordprocessingShape" mc:Ignorable="w14 w15 w16se w16cid w16 w16cex w16sdtdh wp14">
   <w:footnote w:type="separator" w:id="-1">
     <w:p>
       <w:r>
@@ -2427,13 +2542,13 @@
 </file>
 
 <file path=word/header1.xml><?xml version="1.0" encoding="utf-8"?>
-<w:hdr xmlns:wpc="http://schemas.microsoft.com/office/word/2010/wordprocessingCanvas" xmlns:cx="http://schemas.microsoft.com/office/drawing/2014/chartex" xmlns:cx1="http://schemas.microsoft.com/office/drawing/2015/9/8/chartex" xmlns:cx2="http://schemas.microsoft.com/office/drawing/2015/10/21/chartex" xmlns:cx3="http://schemas.microsoft.com/office/drawing/2016/5/9/chartex" xmlns:cx4="http://schemas.microsoft.com/office/drawing/2016/5/10/chartex" xmlns:cx5="http://schemas.microsoft.com/office/drawing/2016/5/11/chartex" xmlns:cx6="http://schemas.microsoft.com/office/drawing/2016/5/12/chartex" xmlns:cx7="http://schemas.microsoft.com/office/drawing/2016/5/13/chartex" xmlns:cx8="http://schemas.microsoft.com/office/drawing/2016/5/14/chartex" xmlns:mc="http://schemas.openxmlformats.org/markup-compatibility/2006" xmlns:aink="http://schemas.microsoft.com/office/drawing/2016/ink" xmlns:am3d="http://schemas.microsoft.com/office/drawing/2017/model3d" xmlns:o="urn:schemas-microsoft-com:office:office" xmlns:oel="http://schemas.microsoft.com/office/2019/extlst" xmlns:r="http://schemas.openxmlformats.org/officeDocument/2006/relationships" xmlns:m="http://schemas.openxmlformats.org/officeDocument/2006/math" xmlns:v="urn:schemas-microsoft-com:vml" xmlns:wp14="http://schemas.microsoft.com/office/word/2010/wordprocessingDrawing" xmlns:wp="http://schemas.openxmlformats.org/drawingml/2006/wordprocessingDrawing" xmlns:w10="urn:schemas-microsoft-com:office:word" xmlns:w="http://schemas.openxmlformats.org/wordprocessingml/2006/main" xmlns:w14="http://schemas.microsoft.com/office/word/2010/wordml" xmlns:w15="http://schemas.microsoft.com/office/word/2012/wordml" xmlns:w16cex="http://schemas.microsoft.com/office/word/2018/wordml/cex" xmlns:w16cid="http://schemas.microsoft.com/office/word/2016/wordml/cid" xmlns:w16="http://schemas.microsoft.com/office/word/2018/wordml" xmlns:w16du="http://schemas.microsoft.com/office/word/2023/wordml/word16du" xmlns:w16sdtdh="http://schemas.microsoft.com/office/word/2020/wordml/sdtdatahash" xmlns:w16sdtfl="http://schemas.microsoft.com/office/word/2024/wordml/sdtformatlock" xmlns:w16se="http://schemas.microsoft.com/office/word/2015/wordml/symex" xmlns:wpg="http://schemas.microsoft.com/office/word/2010/wordprocessingGroup" xmlns:wpi="http://schemas.microsoft.com/office/word/2010/wordprocessingInk" xmlns:wne="http://schemas.microsoft.com/office/word/2006/wordml" xmlns:wps="http://schemas.microsoft.com/office/word/2010/wordprocessingShape" mc:Ignorable="w14 w15 w16se w16cid w16 w16cex w16sdtdh w16sdtfl w16du wp14">
+<w:hdr xmlns:wpc="http://schemas.microsoft.com/office/word/2010/wordprocessingCanvas" xmlns:cx="http://schemas.microsoft.com/office/drawing/2014/chartex" xmlns:cx1="http://schemas.microsoft.com/office/drawing/2015/9/8/chartex" xmlns:cx2="http://schemas.microsoft.com/office/drawing/2015/10/21/chartex" xmlns:cx3="http://schemas.microsoft.com/office/drawing/2016/5/9/chartex" xmlns:cx4="http://schemas.microsoft.com/office/drawing/2016/5/10/chartex" xmlns:cx5="http://schemas.microsoft.com/office/drawing/2016/5/11/chartex" xmlns:cx6="http://schemas.microsoft.com/office/drawing/2016/5/12/chartex" xmlns:cx7="http://schemas.microsoft.com/office/drawing/2016/5/13/chartex" xmlns:cx8="http://schemas.microsoft.com/office/drawing/2016/5/14/chartex" xmlns:mc="http://schemas.openxmlformats.org/markup-compatibility/2006" xmlns:aink="http://schemas.microsoft.com/office/drawing/2016/ink" xmlns:am3d="http://schemas.microsoft.com/office/drawing/2017/model3d" xmlns:o="urn:schemas-microsoft-com:office:office" xmlns:oel="http://schemas.microsoft.com/office/2019/extlst" xmlns:r="http://schemas.openxmlformats.org/officeDocument/2006/relationships" xmlns:m="http://schemas.openxmlformats.org/officeDocument/2006/math" xmlns:v="urn:schemas-microsoft-com:vml" xmlns:wp14="http://schemas.microsoft.com/office/word/2010/wordprocessingDrawing" xmlns:wp="http://schemas.openxmlformats.org/drawingml/2006/wordprocessingDrawing" xmlns:w10="urn:schemas-microsoft-com:office:word" xmlns:w="http://schemas.openxmlformats.org/wordprocessingml/2006/main" xmlns:w14="http://schemas.microsoft.com/office/word/2010/wordml" xmlns:w15="http://schemas.microsoft.com/office/word/2012/wordml" xmlns:w16cex="http://schemas.microsoft.com/office/word/2018/wordml/cex" xmlns:w16cid="http://schemas.microsoft.com/office/word/2016/wordml/cid" xmlns:w16="http://schemas.microsoft.com/office/word/2018/wordml" xmlns:w16sdtdh="http://schemas.microsoft.com/office/word/2020/wordml/sdtdatahash" xmlns:w16se="http://schemas.microsoft.com/office/word/2015/wordml/symex" xmlns:wpg="http://schemas.microsoft.com/office/word/2010/wordprocessingGroup" xmlns:wpi="http://schemas.microsoft.com/office/word/2010/wordprocessingInk" xmlns:wne="http://schemas.microsoft.com/office/word/2006/wordml" xmlns:wps="http://schemas.microsoft.com/office/word/2010/wordprocessingShape" mc:Ignorable="w14 w15 w16se w16cid w16 w16cex w16sdtdh wp14">
   <w:tbl>
     <w:tblPr>
       <w:tblW w:w="9781" w:type="dxa"/>
       <w:jc w:val="center"/>
       <w:tblBorders>
-        <w:bottom w:val="single" w:color="auto" w:sz="12" w:space="0"/>
+        <w:bottom w:val="single" w:sz="12" w:space="0" w:color="auto"/>
       </w:tblBorders>
       <w:tblLayout w:type="fixed"/>
       <w:tblCellMar>
@@ -2479,7 +2594,7 @@
         <w:tcPr>
           <w:tcW w:w="1990" w:type="dxa"/>
           <w:tcBorders>
-            <w:bottom w:val="single" w:color="auto" w:sz="12" w:space="0"/>
+            <w:bottom w:val="single" w:sz="12" w:space="0" w:color="auto"/>
             <w:right w:val="nil"/>
           </w:tcBorders>
           <w:vAlign w:val="center"/>
@@ -2517,7 +2632,11 @@
             <w:jc w:val="right"/>
           </w:pPr>
           <w:r>
-            <w:t>Projet P_</w:t>
+            <w:t xml:space="preserve">Projet </w:t>
+          </w:r>
+          <w:proofErr w:type="spellStart"/>
+          <w:r>
+            <w:t>P_</w:t>
           </w:r>
           <w:r>
             <w:t>Sec</w:t>
@@ -2528,6 +2647,7 @@
           <w:r>
             <w:t>pp</w:t>
           </w:r>
+          <w:proofErr w:type="spellEnd"/>
         </w:p>
       </w:tc>
     </w:tr>
@@ -2541,14 +2661,14 @@
 </file>
 
 <file path=word/header2.xml><?xml version="1.0" encoding="utf-8"?>
-<w:hdr xmlns:wpc="http://schemas.microsoft.com/office/word/2010/wordprocessingCanvas" xmlns:cx="http://schemas.microsoft.com/office/drawing/2014/chartex" xmlns:cx1="http://schemas.microsoft.com/office/drawing/2015/9/8/chartex" xmlns:cx2="http://schemas.microsoft.com/office/drawing/2015/10/21/chartex" xmlns:cx3="http://schemas.microsoft.com/office/drawing/2016/5/9/chartex" xmlns:cx4="http://schemas.microsoft.com/office/drawing/2016/5/10/chartex" xmlns:cx5="http://schemas.microsoft.com/office/drawing/2016/5/11/chartex" xmlns:cx6="http://schemas.microsoft.com/office/drawing/2016/5/12/chartex" xmlns:cx7="http://schemas.microsoft.com/office/drawing/2016/5/13/chartex" xmlns:cx8="http://schemas.microsoft.com/office/drawing/2016/5/14/chartex" xmlns:mc="http://schemas.openxmlformats.org/markup-compatibility/2006" xmlns:aink="http://schemas.microsoft.com/office/drawing/2016/ink" xmlns:am3d="http://schemas.microsoft.com/office/drawing/2017/model3d" xmlns:o="urn:schemas-microsoft-com:office:office" xmlns:oel="http://schemas.microsoft.com/office/2019/extlst" xmlns:r="http://schemas.openxmlformats.org/officeDocument/2006/relationships" xmlns:m="http://schemas.openxmlformats.org/officeDocument/2006/math" xmlns:v="urn:schemas-microsoft-com:vml" xmlns:wp14="http://schemas.microsoft.com/office/word/2010/wordprocessingDrawing" xmlns:wp="http://schemas.openxmlformats.org/drawingml/2006/wordprocessingDrawing" xmlns:w10="urn:schemas-microsoft-com:office:word" xmlns:w="http://schemas.openxmlformats.org/wordprocessingml/2006/main" xmlns:w14="http://schemas.microsoft.com/office/word/2010/wordml" xmlns:w15="http://schemas.microsoft.com/office/word/2012/wordml" xmlns:w16cex="http://schemas.microsoft.com/office/word/2018/wordml/cex" xmlns:w16cid="http://schemas.microsoft.com/office/word/2016/wordml/cid" xmlns:w16="http://schemas.microsoft.com/office/word/2018/wordml" xmlns:w16du="http://schemas.microsoft.com/office/word/2023/wordml/word16du" xmlns:w16sdtdh="http://schemas.microsoft.com/office/word/2020/wordml/sdtdatahash" xmlns:w16sdtfl="http://schemas.microsoft.com/office/word/2024/wordml/sdtformatlock" xmlns:w16se="http://schemas.microsoft.com/office/word/2015/wordml/symex" xmlns:wpg="http://schemas.microsoft.com/office/word/2010/wordprocessingGroup" xmlns:wpi="http://schemas.microsoft.com/office/word/2010/wordprocessingInk" xmlns:wne="http://schemas.microsoft.com/office/word/2006/wordml" xmlns:wps="http://schemas.microsoft.com/office/word/2010/wordprocessingShape" mc:Ignorable="w14 w15 w16se w16cid w16 w16cex w16sdtdh w16sdtfl w16du wp14">
+<w:hdr xmlns:wpc="http://schemas.microsoft.com/office/word/2010/wordprocessingCanvas" xmlns:cx="http://schemas.microsoft.com/office/drawing/2014/chartex" xmlns:cx1="http://schemas.microsoft.com/office/drawing/2015/9/8/chartex" xmlns:cx2="http://schemas.microsoft.com/office/drawing/2015/10/21/chartex" xmlns:cx3="http://schemas.microsoft.com/office/drawing/2016/5/9/chartex" xmlns:cx4="http://schemas.microsoft.com/office/drawing/2016/5/10/chartex" xmlns:cx5="http://schemas.microsoft.com/office/drawing/2016/5/11/chartex" xmlns:cx6="http://schemas.microsoft.com/office/drawing/2016/5/12/chartex" xmlns:cx7="http://schemas.microsoft.com/office/drawing/2016/5/13/chartex" xmlns:cx8="http://schemas.microsoft.com/office/drawing/2016/5/14/chartex" xmlns:mc="http://schemas.openxmlformats.org/markup-compatibility/2006" xmlns:aink="http://schemas.microsoft.com/office/drawing/2016/ink" xmlns:am3d="http://schemas.microsoft.com/office/drawing/2017/model3d" xmlns:o="urn:schemas-microsoft-com:office:office" xmlns:oel="http://schemas.microsoft.com/office/2019/extlst" xmlns:r="http://schemas.openxmlformats.org/officeDocument/2006/relationships" xmlns:m="http://schemas.openxmlformats.org/officeDocument/2006/math" xmlns:v="urn:schemas-microsoft-com:vml" xmlns:wp14="http://schemas.microsoft.com/office/word/2010/wordprocessingDrawing" xmlns:wp="http://schemas.openxmlformats.org/drawingml/2006/wordprocessingDrawing" xmlns:w10="urn:schemas-microsoft-com:office:word" xmlns:w="http://schemas.openxmlformats.org/wordprocessingml/2006/main" xmlns:w14="http://schemas.microsoft.com/office/word/2010/wordml" xmlns:w15="http://schemas.microsoft.com/office/word/2012/wordml" xmlns:w16cex="http://schemas.microsoft.com/office/word/2018/wordml/cex" xmlns:w16cid="http://schemas.microsoft.com/office/word/2016/wordml/cid" xmlns:w16="http://schemas.microsoft.com/office/word/2018/wordml" xmlns:w16sdtdh="http://schemas.microsoft.com/office/word/2020/wordml/sdtdatahash" xmlns:w16se="http://schemas.microsoft.com/office/word/2015/wordml/symex" xmlns:wpg="http://schemas.microsoft.com/office/word/2010/wordprocessingGroup" xmlns:wpi="http://schemas.microsoft.com/office/word/2010/wordprocessingInk" xmlns:wne="http://schemas.microsoft.com/office/word/2006/wordml" xmlns:wps="http://schemas.microsoft.com/office/word/2010/wordprocessingShape" mc:Ignorable="w14 w15 w16se w16cid w16 w16cex w16sdtdh wp14">
   <w:tbl>
     <w:tblPr>
       <w:tblW w:w="9754" w:type="dxa"/>
       <w:tblInd w:w="97" w:type="dxa"/>
       <w:tblBorders>
-        <w:bottom w:val="single" w:color="auto" w:sz="12" w:space="0"/>
-        <w:insideH w:val="single" w:color="auto" w:sz="4" w:space="0"/>
+        <w:bottom w:val="single" w:sz="12" w:space="0" w:color="auto"/>
+        <w:insideH w:val="single" w:sz="4" w:space="0" w:color="auto"/>
       </w:tblBorders>
       <w:tblLayout w:type="fixed"/>
       <w:tblCellMar>
@@ -2606,7 +2726,7 @@
           <w:tcW w:w="2410" w:type="dxa"/>
           <w:tcBorders>
             <w:top w:val="nil"/>
-            <w:bottom w:val="single" w:color="auto" w:sz="12" w:space="0"/>
+            <w:bottom w:val="single" w:sz="12" w:space="0" w:color="auto"/>
             <w:right w:val="nil"/>
           </w:tcBorders>
           <w:vAlign w:val="center"/>
@@ -2652,8 +2772,13 @@
             <w:jc w:val="right"/>
           </w:pPr>
           <w:r>
-            <w:t>Projet : xxxxxx</w:t>
+            <w:t xml:space="preserve">Projet : </w:t>
           </w:r>
+          <w:proofErr w:type="spellStart"/>
+          <w:r>
+            <w:t>xxxxxx</w:t>
+          </w:r>
+          <w:proofErr w:type="spellEnd"/>
         </w:p>
       </w:tc>
     </w:tr>
@@ -2670,7 +2795,7 @@
 </file>
 
 <file path=word/numbering.xml><?xml version="1.0" encoding="utf-8"?>
-<w:numbering xmlns:wpc="http://schemas.microsoft.com/office/word/2010/wordprocessingCanvas" xmlns:cx="http://schemas.microsoft.com/office/drawing/2014/chartex" xmlns:cx1="http://schemas.microsoft.com/office/drawing/2015/9/8/chartex" xmlns:cx2="http://schemas.microsoft.com/office/drawing/2015/10/21/chartex" xmlns:cx3="http://schemas.microsoft.com/office/drawing/2016/5/9/chartex" xmlns:cx4="http://schemas.microsoft.com/office/drawing/2016/5/10/chartex" xmlns:cx5="http://schemas.microsoft.com/office/drawing/2016/5/11/chartex" xmlns:cx6="http://schemas.microsoft.com/office/drawing/2016/5/12/chartex" xmlns:cx7="http://schemas.microsoft.com/office/drawing/2016/5/13/chartex" xmlns:cx8="http://schemas.microsoft.com/office/drawing/2016/5/14/chartex" xmlns:mc="http://schemas.openxmlformats.org/markup-compatibility/2006" xmlns:aink="http://schemas.microsoft.com/office/drawing/2016/ink" xmlns:am3d="http://schemas.microsoft.com/office/drawing/2017/model3d" xmlns:o="urn:schemas-microsoft-com:office:office" xmlns:oel="http://schemas.microsoft.com/office/2019/extlst" xmlns:r="http://schemas.openxmlformats.org/officeDocument/2006/relationships" xmlns:m="http://schemas.openxmlformats.org/officeDocument/2006/math" xmlns:v="urn:schemas-microsoft-com:vml" xmlns:wp14="http://schemas.microsoft.com/office/word/2010/wordprocessingDrawing" xmlns:wp="http://schemas.openxmlformats.org/drawingml/2006/wordprocessingDrawing" xmlns:w10="urn:schemas-microsoft-com:office:word" xmlns:w="http://schemas.openxmlformats.org/wordprocessingml/2006/main" xmlns:w14="http://schemas.microsoft.com/office/word/2010/wordml" xmlns:w15="http://schemas.microsoft.com/office/word/2012/wordml" xmlns:w16cex="http://schemas.microsoft.com/office/word/2018/wordml/cex" xmlns:w16cid="http://schemas.microsoft.com/office/word/2016/wordml/cid" xmlns:w16="http://schemas.microsoft.com/office/word/2018/wordml" xmlns:w16du="http://schemas.microsoft.com/office/word/2023/wordml/word16du" xmlns:w16sdtdh="http://schemas.microsoft.com/office/word/2020/wordml/sdtdatahash" xmlns:w16sdtfl="http://schemas.microsoft.com/office/word/2024/wordml/sdtformatlock" xmlns:w16se="http://schemas.microsoft.com/office/word/2015/wordml/symex" xmlns:wpg="http://schemas.microsoft.com/office/word/2010/wordprocessingGroup" xmlns:wpi="http://schemas.microsoft.com/office/word/2010/wordprocessingInk" xmlns:wne="http://schemas.microsoft.com/office/word/2006/wordml" xmlns:wps="http://schemas.microsoft.com/office/word/2010/wordprocessingShape" mc:Ignorable="w14 w15 w16se w16cid w16 w16cex w16sdtdh w16sdtfl w16du wp14">
+<w:numbering xmlns:wpc="http://schemas.microsoft.com/office/word/2010/wordprocessingCanvas" xmlns:cx="http://schemas.microsoft.com/office/drawing/2014/chartex" xmlns:cx1="http://schemas.microsoft.com/office/drawing/2015/9/8/chartex" xmlns:cx2="http://schemas.microsoft.com/office/drawing/2015/10/21/chartex" xmlns:cx3="http://schemas.microsoft.com/office/drawing/2016/5/9/chartex" xmlns:cx4="http://schemas.microsoft.com/office/drawing/2016/5/10/chartex" xmlns:cx5="http://schemas.microsoft.com/office/drawing/2016/5/11/chartex" xmlns:cx6="http://schemas.microsoft.com/office/drawing/2016/5/12/chartex" xmlns:cx7="http://schemas.microsoft.com/office/drawing/2016/5/13/chartex" xmlns:cx8="http://schemas.microsoft.com/office/drawing/2016/5/14/chartex" xmlns:mc="http://schemas.openxmlformats.org/markup-compatibility/2006" xmlns:aink="http://schemas.microsoft.com/office/drawing/2016/ink" xmlns:am3d="http://schemas.microsoft.com/office/drawing/2017/model3d" xmlns:o="urn:schemas-microsoft-com:office:office" xmlns:oel="http://schemas.microsoft.com/office/2019/extlst" xmlns:r="http://schemas.openxmlformats.org/officeDocument/2006/relationships" xmlns:m="http://schemas.openxmlformats.org/officeDocument/2006/math" xmlns:v="urn:schemas-microsoft-com:vml" xmlns:wp14="http://schemas.microsoft.com/office/word/2010/wordprocessingDrawing" xmlns:wp="http://schemas.openxmlformats.org/drawingml/2006/wordprocessingDrawing" xmlns:w10="urn:schemas-microsoft-com:office:word" xmlns:w="http://schemas.openxmlformats.org/wordprocessingml/2006/main" xmlns:w14="http://schemas.microsoft.com/office/word/2010/wordml" xmlns:w15="http://schemas.microsoft.com/office/word/2012/wordml" xmlns:w16cex="http://schemas.microsoft.com/office/word/2018/wordml/cex" xmlns:w16cid="http://schemas.microsoft.com/office/word/2016/wordml/cid" xmlns:w16="http://schemas.microsoft.com/office/word/2018/wordml" xmlns:w16sdtdh="http://schemas.microsoft.com/office/word/2020/wordml/sdtdatahash" xmlns:w16se="http://schemas.microsoft.com/office/word/2015/wordml/symex" xmlns:wpg="http://schemas.microsoft.com/office/word/2010/wordprocessingGroup" xmlns:wpi="http://schemas.microsoft.com/office/word/2010/wordprocessingInk" xmlns:wne="http://schemas.microsoft.com/office/word/2006/wordml" xmlns:wps="http://schemas.microsoft.com/office/word/2010/wordprocessingShape" mc:Ignorable="w14 w15 w16se w16cid w16 w16cex w16sdtdh wp14">
   <w:abstractNum w:abstractNumId="0" w15:restartNumberingAfterBreak="0">
     <w:nsid w:val="26566A89"/>
     <w:multiLevelType w:val="multilevel"/>
@@ -2830,7 +2955,7 @@
         <w:ind w:left="360" w:hanging="360"/>
       </w:pPr>
       <w:rPr>
-        <w:rFonts w:hint="default" w:ascii="Wingdings" w:hAnsi="Wingdings"/>
+        <w:rFonts w:ascii="Wingdings" w:hAnsi="Wingdings" w:hint="default"/>
       </w:rPr>
     </w:lvl>
     <w:lvl w:ilvl="1">
@@ -2843,7 +2968,7 @@
         <w:ind w:left="720" w:hanging="360"/>
       </w:pPr>
       <w:rPr>
-        <w:rFonts w:hint="default" w:ascii="Wingdings" w:hAnsi="Wingdings"/>
+        <w:rFonts w:ascii="Wingdings" w:hAnsi="Wingdings" w:hint="default"/>
       </w:rPr>
     </w:lvl>
     <w:lvl w:ilvl="2">
@@ -2856,7 +2981,7 @@
         <w:ind w:left="1134" w:firstLine="284"/>
       </w:pPr>
       <w:rPr>
-        <w:rFonts w:hint="default" w:ascii="Wingdings" w:hAnsi="Wingdings"/>
+        <w:rFonts w:ascii="Wingdings" w:hAnsi="Wingdings" w:hint="default"/>
       </w:rPr>
     </w:lvl>
     <w:lvl w:ilvl="3">
@@ -2868,7 +2993,7 @@
         <w:ind w:left="1440" w:hanging="360"/>
       </w:pPr>
       <w:rPr>
-        <w:rFonts w:hint="default" w:ascii="Symbol" w:hAnsi="Symbol"/>
+        <w:rFonts w:ascii="Symbol" w:hAnsi="Symbol" w:hint="default"/>
       </w:rPr>
     </w:lvl>
     <w:lvl w:ilvl="4">
@@ -2880,7 +3005,7 @@
         <w:ind w:left="1800" w:hanging="360"/>
       </w:pPr>
       <w:rPr>
-        <w:rFonts w:hint="default" w:ascii="Symbol" w:hAnsi="Symbol"/>
+        <w:rFonts w:ascii="Symbol" w:hAnsi="Symbol" w:hint="default"/>
       </w:rPr>
     </w:lvl>
     <w:lvl w:ilvl="5">
@@ -2892,7 +3017,7 @@
         <w:ind w:left="2160" w:hanging="360"/>
       </w:pPr>
       <w:rPr>
-        <w:rFonts w:hint="default" w:ascii="Wingdings" w:hAnsi="Wingdings"/>
+        <w:rFonts w:ascii="Wingdings" w:hAnsi="Wingdings" w:hint="default"/>
       </w:rPr>
     </w:lvl>
     <w:lvl w:ilvl="6">
@@ -2904,7 +3029,7 @@
         <w:ind w:left="2520" w:hanging="360"/>
       </w:pPr>
       <w:rPr>
-        <w:rFonts w:hint="default" w:ascii="Wingdings" w:hAnsi="Wingdings"/>
+        <w:rFonts w:ascii="Wingdings" w:hAnsi="Wingdings" w:hint="default"/>
       </w:rPr>
     </w:lvl>
     <w:lvl w:ilvl="7">
@@ -2916,7 +3041,7 @@
         <w:ind w:left="2880" w:hanging="360"/>
       </w:pPr>
       <w:rPr>
-        <w:rFonts w:hint="default" w:ascii="Symbol" w:hAnsi="Symbol"/>
+        <w:rFonts w:ascii="Symbol" w:hAnsi="Symbol" w:hint="default"/>
       </w:rPr>
     </w:lvl>
     <w:lvl w:ilvl="8">
@@ -2928,7 +3053,7 @@
         <w:ind w:left="3240" w:hanging="360"/>
       </w:pPr>
       <w:rPr>
-        <w:rFonts w:hint="default" w:ascii="Symbol" w:hAnsi="Symbol"/>
+        <w:rFonts w:ascii="Symbol" w:hAnsi="Symbol" w:hint="default"/>
       </w:rPr>
     </w:lvl>
   </w:abstractNum>
@@ -3034,7 +3159,7 @@
         <w:ind w:left="720" w:hanging="360"/>
       </w:pPr>
       <w:rPr>
-        <w:rFonts w:hint="default" w:ascii="Symbol" w:hAnsi="Symbol"/>
+        <w:rFonts w:ascii="Symbol" w:hAnsi="Symbol" w:hint="default"/>
       </w:rPr>
     </w:lvl>
     <w:lvl w:ilvl="1" w:tplc="100C0003">
@@ -3046,7 +3171,7 @@
         <w:ind w:left="1440" w:hanging="360"/>
       </w:pPr>
       <w:rPr>
-        <w:rFonts w:hint="default" w:ascii="Courier New" w:hAnsi="Courier New" w:cs="Courier New"/>
+        <w:rFonts w:ascii="Courier New" w:hAnsi="Courier New" w:cs="Courier New" w:hint="default"/>
       </w:rPr>
     </w:lvl>
     <w:lvl w:ilvl="2" w:tplc="100C0005" w:tentative="1">
@@ -3058,7 +3183,7 @@
         <w:ind w:left="2160" w:hanging="360"/>
       </w:pPr>
       <w:rPr>
-        <w:rFonts w:hint="default" w:ascii="Wingdings" w:hAnsi="Wingdings"/>
+        <w:rFonts w:ascii="Wingdings" w:hAnsi="Wingdings" w:hint="default"/>
       </w:rPr>
     </w:lvl>
     <w:lvl w:ilvl="3" w:tplc="100C0001" w:tentative="1">
@@ -3070,7 +3195,7 @@
         <w:ind w:left="2880" w:hanging="360"/>
       </w:pPr>
       <w:rPr>
-        <w:rFonts w:hint="default" w:ascii="Symbol" w:hAnsi="Symbol"/>
+        <w:rFonts w:ascii="Symbol" w:hAnsi="Symbol" w:hint="default"/>
       </w:rPr>
     </w:lvl>
     <w:lvl w:ilvl="4" w:tplc="100C0003" w:tentative="1">
@@ -3082,7 +3207,7 @@
         <w:ind w:left="3600" w:hanging="360"/>
       </w:pPr>
       <w:rPr>
-        <w:rFonts w:hint="default" w:ascii="Courier New" w:hAnsi="Courier New" w:cs="Courier New"/>
+        <w:rFonts w:ascii="Courier New" w:hAnsi="Courier New" w:cs="Courier New" w:hint="default"/>
       </w:rPr>
     </w:lvl>
     <w:lvl w:ilvl="5" w:tplc="100C0005" w:tentative="1">
@@ -3094,7 +3219,7 @@
         <w:ind w:left="4320" w:hanging="360"/>
       </w:pPr>
       <w:rPr>
-        <w:rFonts w:hint="default" w:ascii="Wingdings" w:hAnsi="Wingdings"/>
+        <w:rFonts w:ascii="Wingdings" w:hAnsi="Wingdings" w:hint="default"/>
       </w:rPr>
     </w:lvl>
     <w:lvl w:ilvl="6" w:tplc="100C0001" w:tentative="1">
@@ -3106,7 +3231,7 @@
         <w:ind w:left="5040" w:hanging="360"/>
       </w:pPr>
       <w:rPr>
-        <w:rFonts w:hint="default" w:ascii="Symbol" w:hAnsi="Symbol"/>
+        <w:rFonts w:ascii="Symbol" w:hAnsi="Symbol" w:hint="default"/>
       </w:rPr>
     </w:lvl>
     <w:lvl w:ilvl="7" w:tplc="100C0003" w:tentative="1">
@@ -3118,7 +3243,7 @@
         <w:ind w:left="5760" w:hanging="360"/>
       </w:pPr>
       <w:rPr>
-        <w:rFonts w:hint="default" w:ascii="Courier New" w:hAnsi="Courier New" w:cs="Courier New"/>
+        <w:rFonts w:ascii="Courier New" w:hAnsi="Courier New" w:cs="Courier New" w:hint="default"/>
       </w:rPr>
     </w:lvl>
     <w:lvl w:ilvl="8" w:tplc="100C0005" w:tentative="1">
@@ -3130,7 +3255,7 @@
         <w:ind w:left="6480" w:hanging="360"/>
       </w:pPr>
       <w:rPr>
-        <w:rFonts w:hint="default" w:ascii="Wingdings" w:hAnsi="Wingdings"/>
+        <w:rFonts w:ascii="Wingdings" w:hAnsi="Wingdings" w:hint="default"/>
       </w:rPr>
     </w:lvl>
   </w:abstractNum>
@@ -3236,7 +3361,7 @@
         <w:ind w:left="720" w:hanging="360"/>
       </w:pPr>
       <w:rPr>
-        <w:rFonts w:hint="default" w:ascii="Symbol" w:hAnsi="Symbol"/>
+        <w:rFonts w:ascii="Symbol" w:hAnsi="Symbol" w:hint="default"/>
       </w:rPr>
     </w:lvl>
     <w:lvl w:ilvl="1" w:tplc="100C0003">
@@ -3248,7 +3373,7 @@
         <w:ind w:left="1440" w:hanging="360"/>
       </w:pPr>
       <w:rPr>
-        <w:rFonts w:hint="default" w:ascii="Courier New" w:hAnsi="Courier New" w:cs="Courier New"/>
+        <w:rFonts w:ascii="Courier New" w:hAnsi="Courier New" w:cs="Courier New" w:hint="default"/>
       </w:rPr>
     </w:lvl>
     <w:lvl w:ilvl="2" w:tplc="100C0005" w:tentative="1">
@@ -3260,7 +3385,7 @@
         <w:ind w:left="2160" w:hanging="360"/>
       </w:pPr>
       <w:rPr>
-        <w:rFonts w:hint="default" w:ascii="Wingdings" w:hAnsi="Wingdings"/>
+        <w:rFonts w:ascii="Wingdings" w:hAnsi="Wingdings" w:hint="default"/>
       </w:rPr>
     </w:lvl>
     <w:lvl w:ilvl="3" w:tplc="100C0001" w:tentative="1">
@@ -3272,7 +3397,7 @@
         <w:ind w:left="2880" w:hanging="360"/>
       </w:pPr>
       <w:rPr>
-        <w:rFonts w:hint="default" w:ascii="Symbol" w:hAnsi="Symbol"/>
+        <w:rFonts w:ascii="Symbol" w:hAnsi="Symbol" w:hint="default"/>
       </w:rPr>
     </w:lvl>
     <w:lvl w:ilvl="4" w:tplc="100C0003" w:tentative="1">
@@ -3284,7 +3409,7 @@
         <w:ind w:left="3600" w:hanging="360"/>
       </w:pPr>
       <w:rPr>
-        <w:rFonts w:hint="default" w:ascii="Courier New" w:hAnsi="Courier New" w:cs="Courier New"/>
+        <w:rFonts w:ascii="Courier New" w:hAnsi="Courier New" w:cs="Courier New" w:hint="default"/>
       </w:rPr>
     </w:lvl>
     <w:lvl w:ilvl="5" w:tplc="100C0005" w:tentative="1">
@@ -3296,7 +3421,7 @@
         <w:ind w:left="4320" w:hanging="360"/>
       </w:pPr>
       <w:rPr>
-        <w:rFonts w:hint="default" w:ascii="Wingdings" w:hAnsi="Wingdings"/>
+        <w:rFonts w:ascii="Wingdings" w:hAnsi="Wingdings" w:hint="default"/>
       </w:rPr>
     </w:lvl>
     <w:lvl w:ilvl="6" w:tplc="100C0001" w:tentative="1">
@@ -3308,7 +3433,7 @@
         <w:ind w:left="5040" w:hanging="360"/>
       </w:pPr>
       <w:rPr>
-        <w:rFonts w:hint="default" w:ascii="Symbol" w:hAnsi="Symbol"/>
+        <w:rFonts w:ascii="Symbol" w:hAnsi="Symbol" w:hint="default"/>
       </w:rPr>
     </w:lvl>
     <w:lvl w:ilvl="7" w:tplc="100C0003" w:tentative="1">
@@ -3320,7 +3445,7 @@
         <w:ind w:left="5760" w:hanging="360"/>
       </w:pPr>
       <w:rPr>
-        <w:rFonts w:hint="default" w:ascii="Courier New" w:hAnsi="Courier New" w:cs="Courier New"/>
+        <w:rFonts w:ascii="Courier New" w:hAnsi="Courier New" w:cs="Courier New" w:hint="default"/>
       </w:rPr>
     </w:lvl>
     <w:lvl w:ilvl="8" w:tplc="100C0005" w:tentative="1">
@@ -3332,7 +3457,7 @@
         <w:ind w:left="6480" w:hanging="360"/>
       </w:pPr>
       <w:rPr>
-        <w:rFonts w:hint="default" w:ascii="Wingdings" w:hAnsi="Wingdings"/>
+        <w:rFonts w:ascii="Wingdings" w:hAnsi="Wingdings" w:hint="default"/>
       </w:rPr>
     </w:lvl>
   </w:abstractNum>
@@ -3349,7 +3474,7 @@
         <w:ind w:left="720" w:hanging="360"/>
       </w:pPr>
       <w:rPr>
-        <w:rFonts w:hint="default" w:ascii="Symbol" w:hAnsi="Symbol" w:eastAsia="Times New Roman" w:cs="Times New Roman"/>
+        <w:rFonts w:ascii="Symbol" w:eastAsia="Times New Roman" w:hAnsi="Symbol" w:cs="Times New Roman" w:hint="default"/>
       </w:rPr>
     </w:lvl>
     <w:lvl w:ilvl="1" w:tplc="100C0003">
@@ -3361,7 +3486,7 @@
         <w:ind w:left="1440" w:hanging="360"/>
       </w:pPr>
       <w:rPr>
-        <w:rFonts w:hint="default" w:ascii="Courier New" w:hAnsi="Courier New" w:cs="Courier New"/>
+        <w:rFonts w:ascii="Courier New" w:hAnsi="Courier New" w:cs="Courier New" w:hint="default"/>
       </w:rPr>
     </w:lvl>
     <w:lvl w:ilvl="2" w:tplc="100C0005">
@@ -3373,7 +3498,7 @@
         <w:ind w:left="2160" w:hanging="360"/>
       </w:pPr>
       <w:rPr>
-        <w:rFonts w:hint="default" w:ascii="Wingdings" w:hAnsi="Wingdings"/>
+        <w:rFonts w:ascii="Wingdings" w:hAnsi="Wingdings" w:hint="default"/>
       </w:rPr>
     </w:lvl>
     <w:lvl w:ilvl="3" w:tplc="100C0001" w:tentative="1">
@@ -3385,7 +3510,7 @@
         <w:ind w:left="2880" w:hanging="360"/>
       </w:pPr>
       <w:rPr>
-        <w:rFonts w:hint="default" w:ascii="Symbol" w:hAnsi="Symbol"/>
+        <w:rFonts w:ascii="Symbol" w:hAnsi="Symbol" w:hint="default"/>
       </w:rPr>
     </w:lvl>
     <w:lvl w:ilvl="4" w:tplc="100C0003" w:tentative="1">
@@ -3397,7 +3522,7 @@
         <w:ind w:left="3600" w:hanging="360"/>
       </w:pPr>
       <w:rPr>
-        <w:rFonts w:hint="default" w:ascii="Courier New" w:hAnsi="Courier New" w:cs="Courier New"/>
+        <w:rFonts w:ascii="Courier New" w:hAnsi="Courier New" w:cs="Courier New" w:hint="default"/>
       </w:rPr>
     </w:lvl>
     <w:lvl w:ilvl="5" w:tplc="100C0005" w:tentative="1">
@@ -3409,7 +3534,7 @@
         <w:ind w:left="4320" w:hanging="360"/>
       </w:pPr>
       <w:rPr>
-        <w:rFonts w:hint="default" w:ascii="Wingdings" w:hAnsi="Wingdings"/>
+        <w:rFonts w:ascii="Wingdings" w:hAnsi="Wingdings" w:hint="default"/>
       </w:rPr>
     </w:lvl>
     <w:lvl w:ilvl="6" w:tplc="100C0001" w:tentative="1">
@@ -3421,7 +3546,7 @@
         <w:ind w:left="5040" w:hanging="360"/>
       </w:pPr>
       <w:rPr>
-        <w:rFonts w:hint="default" w:ascii="Symbol" w:hAnsi="Symbol"/>
+        <w:rFonts w:ascii="Symbol" w:hAnsi="Symbol" w:hint="default"/>
       </w:rPr>
     </w:lvl>
     <w:lvl w:ilvl="7" w:tplc="100C0003" w:tentative="1">
@@ -3433,7 +3558,7 @@
         <w:ind w:left="5760" w:hanging="360"/>
       </w:pPr>
       <w:rPr>
-        <w:rFonts w:hint="default" w:ascii="Courier New" w:hAnsi="Courier New" w:cs="Courier New"/>
+        <w:rFonts w:ascii="Courier New" w:hAnsi="Courier New" w:cs="Courier New" w:hint="default"/>
       </w:rPr>
     </w:lvl>
     <w:lvl w:ilvl="8" w:tplc="100C0005" w:tentative="1">
@@ -3445,7 +3570,7 @@
         <w:ind w:left="6480" w:hanging="360"/>
       </w:pPr>
       <w:rPr>
-        <w:rFonts w:hint="default" w:ascii="Wingdings" w:hAnsi="Wingdings"/>
+        <w:rFonts w:ascii="Wingdings" w:hAnsi="Wingdings" w:hint="default"/>
       </w:rPr>
     </w:lvl>
   </w:abstractNum>
@@ -3464,7 +3589,7 @@
         <w:ind w:left="360" w:hanging="360"/>
       </w:pPr>
       <w:rPr>
-        <w:rFonts w:hint="default" w:ascii="Wingdings" w:hAnsi="Wingdings"/>
+        <w:rFonts w:ascii="Wingdings" w:hAnsi="Wingdings" w:hint="default"/>
       </w:rPr>
     </w:lvl>
     <w:lvl w:ilvl="1">
@@ -3477,7 +3602,7 @@
         <w:ind w:left="720" w:hanging="360"/>
       </w:pPr>
       <w:rPr>
-        <w:rFonts w:hint="default" w:ascii="Wingdings" w:hAnsi="Wingdings"/>
+        <w:rFonts w:ascii="Wingdings" w:hAnsi="Wingdings" w:hint="default"/>
       </w:rPr>
     </w:lvl>
     <w:lvl w:ilvl="2">
@@ -3490,7 +3615,7 @@
         <w:ind w:left="1080" w:hanging="360"/>
       </w:pPr>
       <w:rPr>
-        <w:rFonts w:hint="default" w:ascii="Wingdings" w:hAnsi="Wingdings"/>
+        <w:rFonts w:ascii="Wingdings" w:hAnsi="Wingdings" w:hint="default"/>
       </w:rPr>
     </w:lvl>
     <w:lvl w:ilvl="3">
@@ -3502,7 +3627,7 @@
         <w:ind w:left="1440" w:hanging="360"/>
       </w:pPr>
       <w:rPr>
-        <w:rFonts w:hint="default" w:ascii="Symbol" w:hAnsi="Symbol"/>
+        <w:rFonts w:ascii="Symbol" w:hAnsi="Symbol" w:hint="default"/>
       </w:rPr>
     </w:lvl>
     <w:lvl w:ilvl="4">
@@ -3514,7 +3639,7 @@
         <w:ind w:left="1800" w:hanging="360"/>
       </w:pPr>
       <w:rPr>
-        <w:rFonts w:hint="default" w:ascii="Symbol" w:hAnsi="Symbol"/>
+        <w:rFonts w:ascii="Symbol" w:hAnsi="Symbol" w:hint="default"/>
       </w:rPr>
     </w:lvl>
     <w:lvl w:ilvl="5">
@@ -3526,7 +3651,7 @@
         <w:ind w:left="2160" w:hanging="360"/>
       </w:pPr>
       <w:rPr>
-        <w:rFonts w:hint="default" w:ascii="Wingdings" w:hAnsi="Wingdings"/>
+        <w:rFonts w:ascii="Wingdings" w:hAnsi="Wingdings" w:hint="default"/>
       </w:rPr>
     </w:lvl>
     <w:lvl w:ilvl="6">
@@ -3538,7 +3663,7 @@
         <w:ind w:left="2520" w:hanging="360"/>
       </w:pPr>
       <w:rPr>
-        <w:rFonts w:hint="default" w:ascii="Wingdings" w:hAnsi="Wingdings"/>
+        <w:rFonts w:ascii="Wingdings" w:hAnsi="Wingdings" w:hint="default"/>
       </w:rPr>
     </w:lvl>
     <w:lvl w:ilvl="7">
@@ -3550,7 +3675,7 @@
         <w:ind w:left="2880" w:hanging="360"/>
       </w:pPr>
       <w:rPr>
-        <w:rFonts w:hint="default" w:ascii="Symbol" w:hAnsi="Symbol"/>
+        <w:rFonts w:ascii="Symbol" w:hAnsi="Symbol" w:hint="default"/>
       </w:rPr>
     </w:lvl>
     <w:lvl w:ilvl="8">
@@ -3562,7 +3687,7 @@
         <w:ind w:left="3240" w:hanging="360"/>
       </w:pPr>
       <w:rPr>
-        <w:rFonts w:hint="default" w:ascii="Symbol" w:hAnsi="Symbol"/>
+        <w:rFonts w:ascii="Symbol" w:hAnsi="Symbol" w:hint="default"/>
       </w:rPr>
     </w:lvl>
   </w:abstractNum>
@@ -3579,7 +3704,7 @@
         <w:ind w:left="720" w:hanging="360"/>
       </w:pPr>
       <w:rPr>
-        <w:rFonts w:hint="default" w:ascii="Symbol" w:hAnsi="Symbol" w:eastAsia="Times New Roman" w:cs="Times New Roman"/>
+        <w:rFonts w:ascii="Symbol" w:eastAsia="Times New Roman" w:hAnsi="Symbol" w:cs="Times New Roman" w:hint="default"/>
       </w:rPr>
     </w:lvl>
     <w:lvl w:ilvl="1" w:tplc="100C0003" w:tentative="1">
@@ -3591,7 +3716,7 @@
         <w:ind w:left="1440" w:hanging="360"/>
       </w:pPr>
       <w:rPr>
-        <w:rFonts w:hint="default" w:ascii="Courier New" w:hAnsi="Courier New" w:cs="Courier New"/>
+        <w:rFonts w:ascii="Courier New" w:hAnsi="Courier New" w:cs="Courier New" w:hint="default"/>
       </w:rPr>
     </w:lvl>
     <w:lvl w:ilvl="2" w:tplc="100C0005" w:tentative="1">
@@ -3603,7 +3728,7 @@
         <w:ind w:left="2160" w:hanging="360"/>
       </w:pPr>
       <w:rPr>
-        <w:rFonts w:hint="default" w:ascii="Wingdings" w:hAnsi="Wingdings"/>
+        <w:rFonts w:ascii="Wingdings" w:hAnsi="Wingdings" w:hint="default"/>
       </w:rPr>
     </w:lvl>
     <w:lvl w:ilvl="3" w:tplc="100C0001" w:tentative="1">
@@ -3615,7 +3740,7 @@
         <w:ind w:left="2880" w:hanging="360"/>
       </w:pPr>
       <w:rPr>
-        <w:rFonts w:hint="default" w:ascii="Symbol" w:hAnsi="Symbol"/>
+        <w:rFonts w:ascii="Symbol" w:hAnsi="Symbol" w:hint="default"/>
       </w:rPr>
     </w:lvl>
     <w:lvl w:ilvl="4" w:tplc="100C0003" w:tentative="1">
@@ -3627,7 +3752,7 @@
         <w:ind w:left="3600" w:hanging="360"/>
       </w:pPr>
       <w:rPr>
-        <w:rFonts w:hint="default" w:ascii="Courier New" w:hAnsi="Courier New" w:cs="Courier New"/>
+        <w:rFonts w:ascii="Courier New" w:hAnsi="Courier New" w:cs="Courier New" w:hint="default"/>
       </w:rPr>
     </w:lvl>
     <w:lvl w:ilvl="5" w:tplc="100C0005" w:tentative="1">
@@ -3639,7 +3764,7 @@
         <w:ind w:left="4320" w:hanging="360"/>
       </w:pPr>
       <w:rPr>
-        <w:rFonts w:hint="default" w:ascii="Wingdings" w:hAnsi="Wingdings"/>
+        <w:rFonts w:ascii="Wingdings" w:hAnsi="Wingdings" w:hint="default"/>
       </w:rPr>
     </w:lvl>
     <w:lvl w:ilvl="6" w:tplc="100C0001" w:tentative="1">
@@ -3651,7 +3776,7 @@
         <w:ind w:left="5040" w:hanging="360"/>
       </w:pPr>
       <w:rPr>
-        <w:rFonts w:hint="default" w:ascii="Symbol" w:hAnsi="Symbol"/>
+        <w:rFonts w:ascii="Symbol" w:hAnsi="Symbol" w:hint="default"/>
       </w:rPr>
     </w:lvl>
     <w:lvl w:ilvl="7" w:tplc="100C0003" w:tentative="1">
@@ -3663,7 +3788,7 @@
         <w:ind w:left="5760" w:hanging="360"/>
       </w:pPr>
       <w:rPr>
-        <w:rFonts w:hint="default" w:ascii="Courier New" w:hAnsi="Courier New" w:cs="Courier New"/>
+        <w:rFonts w:ascii="Courier New" w:hAnsi="Courier New" w:cs="Courier New" w:hint="default"/>
       </w:rPr>
     </w:lvl>
     <w:lvl w:ilvl="8" w:tplc="100C0005" w:tentative="1">
@@ -3675,7 +3800,7 @@
         <w:ind w:left="6480" w:hanging="360"/>
       </w:pPr>
       <w:rPr>
-        <w:rFonts w:hint="default" w:ascii="Wingdings" w:hAnsi="Wingdings"/>
+        <w:rFonts w:ascii="Wingdings" w:hAnsi="Wingdings" w:hint="default"/>
       </w:rPr>
     </w:lvl>
   </w:abstractNum>
@@ -3816,11 +3941,11 @@
 </file>
 
 <file path=word/styles.xml><?xml version="1.0" encoding="utf-8"?>
-<w:styles xmlns:wp14="http://schemas.microsoft.com/office/word/2010/wordprocessingDrawing" xmlns:mc="http://schemas.openxmlformats.org/markup-compatibility/2006" xmlns:r="http://schemas.openxmlformats.org/officeDocument/2006/relationships" xmlns:w="http://schemas.openxmlformats.org/wordprocessingml/2006/main" xmlns:w14="http://schemas.microsoft.com/office/word/2010/wordml" xmlns:w15="http://schemas.microsoft.com/office/word/2012/wordml" xmlns:w16cex="http://schemas.microsoft.com/office/word/2018/wordml/cex" xmlns:w16cid="http://schemas.microsoft.com/office/word/2016/wordml/cid" xmlns:w16="http://schemas.microsoft.com/office/word/2018/wordml" xmlns:w16du="http://schemas.microsoft.com/office/word/2023/wordml/word16du" xmlns:w16sdtdh="http://schemas.microsoft.com/office/word/2020/wordml/sdtdatahash" xmlns:w16sdtfl="http://schemas.microsoft.com/office/word/2024/wordml/sdtformatlock" xmlns:w16se="http://schemas.microsoft.com/office/word/2015/wordml/symex" mc:Ignorable="w14 w15 w16se w16cid w16 w16cex w16sdtdh w16sdtfl w16du wp14">
+<w:styles xmlns:mc="http://schemas.openxmlformats.org/markup-compatibility/2006" xmlns:r="http://schemas.openxmlformats.org/officeDocument/2006/relationships" xmlns:w="http://schemas.openxmlformats.org/wordprocessingml/2006/main" xmlns:w14="http://schemas.microsoft.com/office/word/2010/wordml" xmlns:w15="http://schemas.microsoft.com/office/word/2012/wordml" xmlns:w16cex="http://schemas.microsoft.com/office/word/2018/wordml/cex" xmlns:w16cid="http://schemas.microsoft.com/office/word/2016/wordml/cid" xmlns:w16="http://schemas.microsoft.com/office/word/2018/wordml" xmlns:w16sdtdh="http://schemas.microsoft.com/office/word/2020/wordml/sdtdatahash" xmlns:w16se="http://schemas.microsoft.com/office/word/2015/wordml/symex" mc:Ignorable="w14 w15 w16se w16cid w16 w16cex w16sdtdh">
   <w:docDefaults>
     <w:rPrDefault>
       <w:rPr>
-        <w:rFonts w:ascii="Times New Roman" w:hAnsi="Times New Roman" w:eastAsia="Times New Roman" w:cs="Times New Roman"/>
+        <w:rFonts w:ascii="Times New Roman" w:eastAsia="Times New Roman" w:hAnsi="Times New Roman" w:cs="Times New Roman"/>
         <w:lang w:val="fr-CH" w:eastAsia="fr-CH" w:bidi="ar-SA"/>
       </w:rPr>
     </w:rPrDefault>
@@ -3974,7 +4099,7 @@
     <w:lsdException w:name="Table Web 2" w:semiHidden="1" w:unhideWhenUsed="1"/>
     <w:lsdException w:name="Table Web 3" w:semiHidden="1" w:unhideWhenUsed="1"/>
     <w:lsdException w:name="Table Theme" w:semiHidden="1" w:unhideWhenUsed="1"/>
-    <w:lsdException w:name="Placeholder Text" w:uiPriority="99" w:semiHidden="1"/>
+    <w:lsdException w:name="Placeholder Text" w:semiHidden="1" w:uiPriority="99"/>
     <w:lsdException w:name="No Spacing" w:uiPriority="1" w:qFormat="1"/>
     <w:lsdException w:name="Light Shading" w:uiPriority="60"/>
     <w:lsdException w:name="Light List" w:uiPriority="61"/>
@@ -3996,7 +4121,7 @@
     <w:lsdException w:name="Medium Shading 1 Accent 1" w:uiPriority="63"/>
     <w:lsdException w:name="Medium Shading 2 Accent 1" w:uiPriority="64"/>
     <w:lsdException w:name="Medium List 1 Accent 1" w:uiPriority="65"/>
-    <w:lsdException w:name="Revision" w:uiPriority="99" w:semiHidden="1"/>
+    <w:lsdException w:name="Revision" w:semiHidden="1" w:uiPriority="99"/>
     <w:lsdException w:name="List Paragraph" w:uiPriority="34" w:qFormat="1"/>
     <w:lsdException w:name="Quote" w:uiPriority="29" w:qFormat="1"/>
     <w:lsdException w:name="Intense Quote" w:uiPriority="30" w:qFormat="1"/>
@@ -4083,8 +4208,8 @@
     <w:lsdException w:name="Subtle Reference" w:uiPriority="31" w:qFormat="1"/>
     <w:lsdException w:name="Intense Reference" w:uiPriority="32" w:qFormat="1"/>
     <w:lsdException w:name="Book Title" w:uiPriority="33" w:qFormat="1"/>
-    <w:lsdException w:name="Bibliography" w:uiPriority="37" w:semiHidden="1" w:unhideWhenUsed="1"/>
-    <w:lsdException w:name="TOC Heading" w:uiPriority="39" w:semiHidden="1" w:unhideWhenUsed="1" w:qFormat="1"/>
+    <w:lsdException w:name="Bibliography" w:semiHidden="1" w:uiPriority="37" w:unhideWhenUsed="1"/>
+    <w:lsdException w:name="TOC Heading" w:semiHidden="1" w:uiPriority="39" w:unhideWhenUsed="1" w:qFormat="1"/>
     <w:lsdException w:name="Plain Table 1" w:uiPriority="41"/>
     <w:lsdException w:name="Plain Table 2" w:uiPriority="42"/>
     <w:lsdException w:name="Plain Table 3" w:uiPriority="43"/>
@@ -4189,13 +4314,13 @@
     <w:lsdException w:name="List Table 5 Dark Accent 6" w:uiPriority="50"/>
     <w:lsdException w:name="List Table 6 Colorful Accent 6" w:uiPriority="51"/>
     <w:lsdException w:name="List Table 7 Colorful Accent 6" w:uiPriority="52"/>
-    <w:lsdException w:name="Mention" w:uiPriority="99" w:semiHidden="1" w:unhideWhenUsed="1"/>
-    <w:lsdException w:name="Smart Hyperlink" w:uiPriority="99" w:semiHidden="1" w:unhideWhenUsed="1"/>
-    <w:lsdException w:name="Hashtag" w:uiPriority="99" w:semiHidden="1" w:unhideWhenUsed="1"/>
-    <w:lsdException w:name="Unresolved Mention" w:uiPriority="99" w:semiHidden="1" w:unhideWhenUsed="1"/>
-    <w:lsdException w:name="Smart Link" w:uiPriority="99" w:semiHidden="1" w:unhideWhenUsed="1"/>
+    <w:lsdException w:name="Mention" w:semiHidden="1" w:uiPriority="99" w:unhideWhenUsed="1"/>
+    <w:lsdException w:name="Smart Hyperlink" w:semiHidden="1" w:uiPriority="99" w:unhideWhenUsed="1"/>
+    <w:lsdException w:name="Hashtag" w:semiHidden="1" w:uiPriority="99" w:unhideWhenUsed="1"/>
+    <w:lsdException w:name="Unresolved Mention" w:semiHidden="1" w:uiPriority="99" w:unhideWhenUsed="1"/>
+    <w:lsdException w:name="Smart Link" w:semiHidden="1" w:uiPriority="99" w:unhideWhenUsed="1"/>
   </w:latentStyles>
-  <w:style w:type="paragraph" w:styleId="Normal" w:default="1">
+  <w:style w:type="paragraph" w:default="1" w:styleId="Normal">
     <w:name w:val="Normal"/>
     <w:qFormat/>
     <w:rsid w:val="00B85085"/>
@@ -4400,13 +4525,13 @@
       <w:rFonts w:cs="Arial"/>
     </w:rPr>
   </w:style>
-  <w:style w:type="character" w:styleId="Policepardfaut" w:default="1">
+  <w:style w:type="character" w:default="1" w:styleId="Policepardfaut">
     <w:name w:val="Default Paragraph Font"/>
     <w:uiPriority w:val="1"/>
     <w:semiHidden/>
     <w:unhideWhenUsed/>
   </w:style>
-  <w:style w:type="table" w:styleId="TableauNormal" w:default="1">
+  <w:style w:type="table" w:default="1" w:styleId="TableauNormal">
     <w:name w:val="Normal Table"/>
     <w:uiPriority w:val="99"/>
     <w:semiHidden/>
@@ -4421,7 +4546,7 @@
       </w:tblCellMar>
     </w:tblPr>
   </w:style>
-  <w:style w:type="numbering" w:styleId="Aucuneliste" w:default="1">
+  <w:style w:type="numbering" w:default="1" w:styleId="Aucuneliste">
     <w:name w:val="No List"/>
     <w:uiPriority w:val="99"/>
     <w:semiHidden/>
@@ -4463,16 +4588,16 @@
     <w:rsid w:val="00AF7342"/>
     <w:tblPr>
       <w:tblBorders>
-        <w:top w:val="single" w:color="auto" w:sz="4" w:space="0"/>
-        <w:left w:val="single" w:color="auto" w:sz="4" w:space="0"/>
-        <w:bottom w:val="single" w:color="auto" w:sz="4" w:space="0"/>
-        <w:right w:val="single" w:color="auto" w:sz="4" w:space="0"/>
-        <w:insideH w:val="single" w:color="auto" w:sz="4" w:space="0"/>
-        <w:insideV w:val="single" w:color="auto" w:sz="4" w:space="0"/>
+        <w:top w:val="single" w:sz="4" w:space="0" w:color="auto"/>
+        <w:left w:val="single" w:sz="4" w:space="0" w:color="auto"/>
+        <w:bottom w:val="single" w:sz="4" w:space="0" w:color="auto"/>
+        <w:right w:val="single" w:sz="4" w:space="0" w:color="auto"/>
+        <w:insideH w:val="single" w:sz="4" w:space="0" w:color="auto"/>
+        <w:insideV w:val="single" w:sz="4" w:space="0" w:color="auto"/>
       </w:tblBorders>
     </w:tblPr>
   </w:style>
-  <w:style w:type="character" w:styleId="Titre1Car" w:customStyle="1">
+  <w:style w:type="character" w:customStyle="1" w:styleId="Titre1Car">
     <w:name w:val="Titre 1 Car"/>
     <w:basedOn w:val="Policepardfaut"/>
     <w:link w:val="Titre1"/>
@@ -4521,8 +4646,8 @@
       <w:tblPr/>
       <w:tcPr>
         <w:tcBorders>
-          <w:tl2br w:val="none" w:color="auto" w:sz="0" w:space="0"/>
-          <w:tr2bl w:val="none" w:color="auto" w:sz="0" w:space="0"/>
+          <w:tl2br w:val="none" w:sz="0" w:space="0" w:color="auto"/>
+          <w:tr2bl w:val="none" w:sz="0" w:space="0" w:color="auto"/>
         </w:tcBorders>
       </w:tcPr>
     </w:tblStylePr>
@@ -4530,11 +4655,11 @@
       <w:tblPr/>
       <w:tcPr>
         <w:tcBorders>
-          <w:top w:val="none" w:color="auto" w:sz="0" w:space="0"/>
-          <w:bottom w:val="none" w:color="auto" w:sz="0" w:space="0"/>
-          <w:right w:val="single" w:color="808080" w:sz="6" w:space="0"/>
-          <w:tl2br w:val="none" w:color="auto" w:sz="0" w:space="0"/>
-          <w:tr2bl w:val="none" w:color="auto" w:sz="0" w:space="0"/>
+          <w:top w:val="none" w:sz="0" w:space="0" w:color="auto"/>
+          <w:bottom w:val="none" w:sz="0" w:space="0" w:color="auto"/>
+          <w:right w:val="single" w:sz="6" w:space="0" w:color="808080"/>
+          <w:tl2br w:val="none" w:sz="0" w:space="0" w:color="auto"/>
+          <w:tr2bl w:val="none" w:sz="0" w:space="0" w:color="auto"/>
         </w:tcBorders>
       </w:tcPr>
     </w:tblStylePr>
@@ -4542,9 +4667,9 @@
       <w:tblPr/>
       <w:tcPr>
         <w:tcBorders>
-          <w:right w:val="single" w:color="FFFFFF" w:sz="6" w:space="0"/>
-          <w:tl2br w:val="none" w:color="auto" w:sz="0" w:space="0"/>
-          <w:tr2bl w:val="none" w:color="auto" w:sz="0" w:space="0"/>
+          <w:right w:val="single" w:sz="6" w:space="0" w:color="FFFFFF"/>
+          <w:tl2br w:val="none" w:sz="0" w:space="0" w:color="auto"/>
+          <w:tr2bl w:val="none" w:sz="0" w:space="0" w:color="auto"/>
         </w:tcBorders>
       </w:tcPr>
     </w:tblStylePr>
@@ -4570,10 +4695,10 @@
       <w:tblPr/>
       <w:tcPr>
         <w:tcBorders>
-          <w:top w:val="single" w:color="808080" w:sz="6" w:space="0"/>
-          <w:bottom w:val="single" w:color="FFFFFF" w:sz="6" w:space="0"/>
-          <w:tl2br w:val="none" w:color="auto" w:sz="0" w:space="0"/>
-          <w:tr2bl w:val="none" w:color="auto" w:sz="0" w:space="0"/>
+          <w:top w:val="single" w:sz="6" w:space="0" w:color="808080"/>
+          <w:bottom w:val="single" w:sz="6" w:space="0" w:color="FFFFFF"/>
+          <w:tl2br w:val="none" w:sz="0" w:space="0" w:color="auto"/>
+          <w:tr2bl w:val="none" w:sz="0" w:space="0" w:color="auto"/>
         </w:tcBorders>
       </w:tcPr>
     </w:tblStylePr>
@@ -4585,8 +4710,8 @@
       <w:tblPr/>
       <w:tcPr>
         <w:tcBorders>
-          <w:tl2br w:val="none" w:color="auto" w:sz="0" w:space="0"/>
-          <w:tr2bl w:val="none" w:color="auto" w:sz="0" w:space="0"/>
+          <w:tl2br w:val="none" w:sz="0" w:space="0" w:color="auto"/>
+          <w:tr2bl w:val="none" w:sz="0" w:space="0" w:color="auto"/>
         </w:tcBorders>
       </w:tcPr>
     </w:tblStylePr>
@@ -4598,12 +4723,12 @@
     <w:tblPr>
       <w:tblCellSpacing w:w="20" w:type="dxa"/>
       <w:tblBorders>
-        <w:top w:val="outset" w:color="auto" w:sz="24" w:space="0"/>
-        <w:left w:val="outset" w:color="auto" w:sz="24" w:space="0"/>
-        <w:bottom w:val="outset" w:color="auto" w:sz="24" w:space="0"/>
-        <w:right w:val="outset" w:color="auto" w:sz="24" w:space="0"/>
-        <w:insideH w:val="outset" w:color="auto" w:sz="6" w:space="0"/>
-        <w:insideV w:val="outset" w:color="auto" w:sz="6" w:space="0"/>
+        <w:top w:val="outset" w:sz="24" w:space="0" w:color="auto"/>
+        <w:left w:val="outset" w:sz="24" w:space="0" w:color="auto"/>
+        <w:bottom w:val="outset" w:sz="24" w:space="0" w:color="auto"/>
+        <w:right w:val="outset" w:sz="24" w:space="0" w:color="auto"/>
+        <w:insideH w:val="outset" w:sz="6" w:space="0" w:color="auto"/>
+        <w:insideV w:val="outset" w:sz="6" w:space="0" w:color="auto"/>
       </w:tblBorders>
     </w:tblPr>
     <w:trPr>
@@ -4619,8 +4744,8 @@
       <w:tblPr/>
       <w:tcPr>
         <w:tcBorders>
-          <w:tl2br w:val="none" w:color="auto" w:sz="0" w:space="0"/>
-          <w:tr2bl w:val="none" w:color="auto" w:sz="0" w:space="0"/>
+          <w:tl2br w:val="none" w:sz="0" w:space="0" w:color="auto"/>
+          <w:tr2bl w:val="none" w:sz="0" w:space="0" w:color="auto"/>
         </w:tcBorders>
       </w:tcPr>
     </w:tblStylePr>
@@ -4692,7 +4817,7 @@
       <w:ind w:left="440" w:hanging="440"/>
     </w:pPr>
   </w:style>
-  <w:style w:type="paragraph" w:styleId="paragraphe1" w:customStyle="1">
+  <w:style w:type="paragraph" w:customStyle="1" w:styleId="paragraphe1">
     <w:name w:val="paragraphe1"/>
     <w:basedOn w:val="Normal"/>
     <w:rsid w:val="000C4CDE"/>
@@ -4707,7 +4832,7 @@
       <w:iCs/>
     </w:rPr>
   </w:style>
-  <w:style w:type="paragraph" w:styleId="paragraphe3" w:customStyle="1">
+  <w:style w:type="paragraph" w:customStyle="1" w:styleId="paragraphe3">
     <w:name w:val="paragraphe3"/>
     <w:basedOn w:val="Normal"/>
     <w:rsid w:val="00235E51"/>
@@ -4715,7 +4840,7 @@
       <w:ind w:left="1758"/>
     </w:pPr>
   </w:style>
-  <w:style w:type="paragraph" w:styleId="paragraphe2Car" w:customStyle="1">
+  <w:style w:type="paragraph" w:customStyle="1" w:styleId="paragraphe2Car">
     <w:name w:val="paragraphe2 Car"/>
     <w:basedOn w:val="Normal"/>
     <w:link w:val="paragraphe2CarCar"/>
@@ -4724,7 +4849,7 @@
       <w:ind w:left="1021"/>
     </w:pPr>
   </w:style>
-  <w:style w:type="character" w:styleId="paragraphe2CarCar" w:customStyle="1">
+  <w:style w:type="character" w:customStyle="1" w:styleId="paragraphe2CarCar">
     <w:name w:val="paragraphe2 Car Car"/>
     <w:basedOn w:val="Policepardfaut"/>
     <w:link w:val="paragraphe2Car"/>
@@ -4736,7 +4861,7 @@
       <w:lang w:val="fr-FR" w:eastAsia="fr-FR" w:bidi="ar-SA"/>
     </w:rPr>
   </w:style>
-  <w:style w:type="paragraph" w:styleId="Pages" w:customStyle="1">
+  <w:style w:type="paragraph" w:customStyle="1" w:styleId="Pages">
     <w:name w:val="Pages"/>
     <w:basedOn w:val="Normal"/>
     <w:rsid w:val="00042C31"/>
@@ -4749,7 +4874,7 @@
       <w:lang w:val="fr-CA"/>
     </w:rPr>
   </w:style>
-  <w:style w:type="character" w:styleId="Titre2Car" w:customStyle="1">
+  <w:style w:type="character" w:customStyle="1" w:styleId="Titre2Car">
     <w:name w:val="Titre 2 Car"/>
     <w:basedOn w:val="Policepardfaut"/>
     <w:link w:val="Titre2"/>
@@ -4772,7 +4897,7 @@
       <w:jc w:val="both"/>
     </w:pPr>
   </w:style>
-  <w:style w:type="paragraph" w:styleId="TexteTableau" w:customStyle="1">
+  <w:style w:type="paragraph" w:customStyle="1" w:styleId="TexteTableau">
     <w:name w:val="TexteTableau"/>
     <w:basedOn w:val="Corpsdetexte"/>
     <w:rsid w:val="008D06A1"/>
@@ -4780,7 +4905,7 @@
       <w:spacing w:before="60" w:after="60"/>
     </w:pPr>
   </w:style>
-  <w:style w:type="paragraph" w:styleId="email" w:customStyle="1">
+  <w:style w:type="paragraph" w:customStyle="1" w:styleId="email">
     <w:name w:val="email"/>
     <w:basedOn w:val="Corpsdetexte"/>
     <w:next w:val="Corpsdetexte"/>
@@ -4791,7 +4916,7 @@
       <w:sz w:val="16"/>
     </w:rPr>
   </w:style>
-  <w:style w:type="character" w:styleId="CorpsdetexteCar" w:customStyle="1">
+  <w:style w:type="character" w:customStyle="1" w:styleId="CorpsdetexteCar">
     <w:name w:val="Corps de texte Car"/>
     <w:basedOn w:val="Policepardfaut"/>
     <w:link w:val="Corpsdetexte"/>
@@ -4803,7 +4928,7 @@
       <w:lang w:val="fr-FR" w:eastAsia="fr-FR"/>
     </w:rPr>
   </w:style>
-  <w:style w:type="character" w:styleId="emailCar" w:customStyle="1">
+  <w:style w:type="character" w:customStyle="1" w:styleId="emailCar">
     <w:name w:val="email Car"/>
     <w:basedOn w:val="CorpsdetexteCar"/>
     <w:link w:val="email"/>
@@ -4816,7 +4941,7 @@
       <w:lang w:val="fr-FR" w:eastAsia="fr-FR"/>
     </w:rPr>
   </w:style>
-  <w:style w:type="paragraph" w:styleId="NOM" w:customStyle="1">
+  <w:style w:type="paragraph" w:customStyle="1" w:styleId="NOM">
     <w:name w:val="NOM"/>
     <w:basedOn w:val="Corpsdetexte"/>
     <w:next w:val="Corpsdetexte"/>
@@ -4830,7 +4955,7 @@
       <w:caps/>
     </w:rPr>
   </w:style>
-  <w:style w:type="character" w:styleId="NOMCar" w:customStyle="1">
+  <w:style w:type="character" w:customStyle="1" w:styleId="NOMCar">
     <w:name w:val="NOM Car"/>
     <w:basedOn w:val="CorpsdetexteCar"/>
     <w:link w:val="NOM"/>
@@ -4850,10 +4975,10 @@
     <w:rsid w:val="001568C8"/>
     <w:tblPr>
       <w:tblBorders>
-        <w:top w:val="single" w:color="000000" w:sz="12" w:space="0"/>
-        <w:left w:val="single" w:color="000000" w:sz="6" w:space="0"/>
-        <w:bottom w:val="single" w:color="000000" w:sz="12" w:space="0"/>
-        <w:right w:val="single" w:color="000000" w:sz="6" w:space="0"/>
+        <w:top w:val="single" w:sz="12" w:space="0" w:color="000000"/>
+        <w:left w:val="single" w:sz="6" w:space="0" w:color="000000"/>
+        <w:bottom w:val="single" w:sz="12" w:space="0" w:color="000000"/>
+        <w:right w:val="single" w:sz="6" w:space="0" w:color="000000"/>
       </w:tblBorders>
     </w:tblPr>
     <w:tcPr>
@@ -4873,7 +4998,7 @@
       <w:tblPr/>
       <w:tcPr>
         <w:tcBorders>
-          <w:bottom w:val="single" w:color="000000" w:sz="6" w:space="0"/>
+          <w:bottom w:val="single" w:sz="6" w:space="0" w:color="000000"/>
         </w:tcBorders>
         <w:shd w:val="pct50" w:color="000080" w:fill="FFFFFF"/>
         <w:vAlign w:val="center"/>
@@ -4886,9 +5011,9 @@
       <w:tblPr/>
       <w:tcPr>
         <w:tcBorders>
-          <w:bottom w:val="single" w:color="000000" w:sz="6" w:space="0"/>
-          <w:tl2br w:val="none" w:color="auto" w:sz="0" w:space="0"/>
-          <w:tr2bl w:val="none" w:color="auto" w:sz="0" w:space="0"/>
+          <w:bottom w:val="single" w:sz="6" w:space="0" w:color="000000"/>
+          <w:tl2br w:val="none" w:sz="0" w:space="0" w:color="auto"/>
+          <w:tr2bl w:val="none" w:sz="0" w:space="0" w:color="auto"/>
         </w:tcBorders>
         <w:shd w:val="pct50" w:color="000000" w:fill="FFFFFF"/>
       </w:tcPr>
@@ -4901,8 +5026,8 @@
       <w:tblPr/>
       <w:tcPr>
         <w:tcBorders>
-          <w:tl2br w:val="none" w:color="auto" w:sz="0" w:space="0"/>
-          <w:tr2bl w:val="none" w:color="auto" w:sz="0" w:space="0"/>
+          <w:tl2br w:val="none" w:sz="0" w:space="0" w:color="auto"/>
+          <w:tr2bl w:val="none" w:sz="0" w:space="0" w:color="auto"/>
         </w:tcBorders>
       </w:tcPr>
     </w:tblStylePr>
@@ -4914,8 +5039,8 @@
       <w:tblPr/>
       <w:tcPr>
         <w:tcBorders>
-          <w:tl2br w:val="none" w:color="auto" w:sz="0" w:space="0"/>
-          <w:tr2bl w:val="none" w:color="auto" w:sz="0" w:space="0"/>
+          <w:tl2br w:val="none" w:sz="0" w:space="0" w:color="auto"/>
+          <w:tr2bl w:val="none" w:sz="0" w:space="0" w:color="auto"/>
         </w:tcBorders>
       </w:tcPr>
     </w:tblStylePr>
@@ -4926,8 +5051,8 @@
       <w:tblPr/>
       <w:tcPr>
         <w:tcBorders>
-          <w:tl2br w:val="none" w:color="auto" w:sz="0" w:space="0"/>
-          <w:tr2bl w:val="none" w:color="auto" w:sz="0" w:space="0"/>
+          <w:tl2br w:val="none" w:sz="0" w:space="0" w:color="auto"/>
+          <w:tr2bl w:val="none" w:sz="0" w:space="0" w:color="auto"/>
         </w:tcBorders>
       </w:tcPr>
     </w:tblStylePr>
@@ -4953,7 +5078,7 @@
       <w:jc w:val="both"/>
     </w:pPr>
   </w:style>
-  <w:style w:type="paragraph" w:styleId="Paragraphe" w:customStyle="1">
+  <w:style w:type="paragraph" w:customStyle="1" w:styleId="Paragraphe">
     <w:name w:val="Paragraphe"/>
     <w:basedOn w:val="Normal"/>
     <w:qFormat/>
@@ -5054,7 +5179,7 @@
       <w:szCs w:val="20"/>
     </w:rPr>
   </w:style>
-  <w:style w:type="character" w:styleId="CommentaireCar" w:customStyle="1">
+  <w:style w:type="character" w:customStyle="1" w:styleId="CommentaireCar">
     <w:name w:val="Commentaire Car"/>
     <w:basedOn w:val="Policepardfaut"/>
     <w:link w:val="Commentaire"/>
@@ -5077,7 +5202,7 @@
       <w:bCs/>
     </w:rPr>
   </w:style>
-  <w:style w:type="character" w:styleId="ObjetducommentaireCar" w:customStyle="1">
+  <w:style w:type="character" w:customStyle="1" w:styleId="ObjetducommentaireCar">
     <w:name w:val="Objet du commentaire Car"/>
     <w:basedOn w:val="CommentaireCar"/>
     <w:link w:val="Objetducommentaire"/>
@@ -5377,30 +5502,6 @@
 </file>
 
 <file path=customXml/item1.xml><?xml version="1.0" encoding="utf-8"?>
-<p:properties xmlns:p="http://schemas.microsoft.com/office/2006/metadata/properties" xmlns:xsi="http://www.w3.org/2001/XMLSchema-instance" xmlns:pc="http://schemas.microsoft.com/office/infopath/2007/PartnerControls">
-  <documentManagement>
-    <lcf76f155ced4ddcb4097134ff3c332f xmlns="eb2b4dc0-5538-4988-a426-1e3bf3687743">
-      <Terms xmlns="http://schemas.microsoft.com/office/infopath/2007/PartnerControls"/>
-    </lcf76f155ced4ddcb4097134ff3c332f>
-    <TaxCatchAll xmlns="26488081-7094-48e3-a435-bbb366c5709a" xsi:nil="true"/>
-  </documentManagement>
-</p:properties>
-</file>
-
-<file path=customXml/item2.xml><?xml version="1.0" encoding="utf-8"?>
-<b:Sources xmlns:b="http://schemas.openxmlformats.org/officeDocument/2006/bibliography" xmlns="http://schemas.openxmlformats.org/officeDocument/2006/bibliography" SelectedStyle="\APASixthEditionOfficeOnline.xsl" StyleName="APA" Version="6"/>
-</file>
-
-<file path=customXml/item3.xml><?xml version="1.0" encoding="utf-8"?>
-<?mso-contentType ?>
-<FormTemplates xmlns="http://schemas.microsoft.com/sharepoint/v3/contenttype/forms">
-  <Display>DocumentLibraryForm</Display>
-  <Edit>DocumentLibraryForm</Edit>
-  <New>DocumentLibraryForm</New>
-</FormTemplates>
-</file>
-
-<file path=customXml/item4.xml><?xml version="1.0" encoding="utf-8"?>
 <ct:contentTypeSchema xmlns:ct="http://schemas.microsoft.com/office/2006/metadata/contentType" xmlns:ma="http://schemas.microsoft.com/office/2006/metadata/properties/metaAttributes" ct:_="" ma:_="" ma:contentTypeName="Document" ma:contentTypeID="0x010100BD12CA962D3BC343BA4881942FCA9ABD" ma:contentTypeVersion="13" ma:contentTypeDescription="Crée un document." ma:contentTypeScope="" ma:versionID="4207f87ec79b8c56022de88b50245427">
   <xsd:schema xmlns:xsd="http://www.w3.org/2001/XMLSchema" xmlns:xs="http://www.w3.org/2001/XMLSchema" xmlns:p="http://schemas.microsoft.com/office/2006/metadata/properties" xmlns:ns2="eb2b4dc0-5538-4988-a426-1e3bf3687743" xmlns:ns3="26488081-7094-48e3-a435-bbb366c5709a" targetNamespace="http://schemas.microsoft.com/office/2006/metadata/properties" ma:root="true" ma:fieldsID="c8b9e57990b270170ec0b599fde8fb20" ns2:_="" ns3:_="">
     <xsd:import namespace="eb2b4dc0-5538-4988-a426-1e3bf3687743"/>
@@ -5607,34 +5708,31 @@
 </ct:contentTypeSchema>
 </file>
 
-<file path=customXml/itemProps1.xml><?xml version="1.0" encoding="utf-8"?>
-<ds:datastoreItem xmlns:ds="http://schemas.openxmlformats.org/officeDocument/2006/customXml" ds:itemID="{B08EA9E8-3BB5-4A76-8042-864F008FC2FE}">
-  <ds:schemaRefs>
-    <ds:schemaRef ds:uri="http://schemas.microsoft.com/office/2006/metadata/properties"/>
-    <ds:schemaRef ds:uri="http://schemas.microsoft.com/office/infopath/2007/PartnerControls"/>
-    <ds:schemaRef ds:uri="eb2b4dc0-5538-4988-a426-1e3bf3687743"/>
-    <ds:schemaRef ds:uri="26488081-7094-48e3-a435-bbb366c5709a"/>
-  </ds:schemaRefs>
-</ds:datastoreItem>
+<file path=customXml/item2.xml><?xml version="1.0" encoding="utf-8"?>
+<?mso-contentType ?>
+<FormTemplates xmlns="http://schemas.microsoft.com/sharepoint/v3/contenttype/forms">
+  <Display>DocumentLibraryForm</Display>
+  <Edit>DocumentLibraryForm</Edit>
+  <New>DocumentLibraryForm</New>
+</FormTemplates>
 </file>
 
-<file path=customXml/itemProps2.xml><?xml version="1.0" encoding="utf-8"?>
-<ds:datastoreItem xmlns:ds="http://schemas.openxmlformats.org/officeDocument/2006/customXml" ds:itemID="{50E1B932-765D-4A46-B44C-F60190630047}">
-  <ds:schemaRefs>
-    <ds:schemaRef ds:uri="http://schemas.openxmlformats.org/officeDocument/2006/bibliography"/>
-  </ds:schemaRefs>
-</ds:datastoreItem>
+<file path=customXml/item3.xml><?xml version="1.0" encoding="utf-8"?>
+<b:Sources xmlns:b="http://schemas.openxmlformats.org/officeDocument/2006/bibliography" xmlns="http://schemas.openxmlformats.org/officeDocument/2006/bibliography" SelectedStyle="\APASixthEditionOfficeOnline.xsl" StyleName="APA" Version="6"/>
 </file>
 
-<file path=customXml/itemProps3.xml><?xml version="1.0" encoding="utf-8"?>
-<ds:datastoreItem xmlns:ds="http://schemas.openxmlformats.org/officeDocument/2006/customXml" ds:itemID="{9C3B4223-E2BD-4178-9996-49553D9C6F4A}">
-  <ds:schemaRefs>
-    <ds:schemaRef ds:uri="http://schemas.microsoft.com/sharepoint/v3/contenttype/forms"/>
-  </ds:schemaRefs>
-</ds:datastoreItem>
+<file path=customXml/item4.xml><?xml version="1.0" encoding="utf-8"?>
+<p:properties xmlns:p="http://schemas.microsoft.com/office/2006/metadata/properties" xmlns:xsi="http://www.w3.org/2001/XMLSchema-instance" xmlns:pc="http://schemas.microsoft.com/office/infopath/2007/PartnerControls">
+  <documentManagement>
+    <lcf76f155ced4ddcb4097134ff3c332f xmlns="eb2b4dc0-5538-4988-a426-1e3bf3687743">
+      <Terms xmlns="http://schemas.microsoft.com/office/infopath/2007/PartnerControls"/>
+    </lcf76f155ced4ddcb4097134ff3c332f>
+    <TaxCatchAll xmlns="26488081-7094-48e3-a435-bbb366c5709a" xsi:nil="true"/>
+  </documentManagement>
+</p:properties>
 </file>
 
-<file path=customXml/itemProps4.xml><?xml version="1.0" encoding="utf-8"?>
+<file path=customXml/itemProps1.xml><?xml version="1.0" encoding="utf-8"?>
 <ds:datastoreItem xmlns:ds="http://schemas.openxmlformats.org/officeDocument/2006/customXml" ds:itemID="{43231C6A-959F-4B0D-A98E-F4EFD2DE8C49}">
   <ds:schemaRefs>
     <ds:schemaRef ds:uri="http://schemas.microsoft.com/office/2006/metadata/contentType"/>
@@ -5651,4 +5749,31 @@
     <ds:schemaRef ds:uri="http://schemas.microsoft.com/internal/obd"/>
   </ds:schemaRefs>
 </ds:datastoreItem>
+</file>
+
+<file path=customXml/itemProps2.xml><?xml version="1.0" encoding="utf-8"?>
+<ds:datastoreItem xmlns:ds="http://schemas.openxmlformats.org/officeDocument/2006/customXml" ds:itemID="{9C3B4223-E2BD-4178-9996-49553D9C6F4A}">
+  <ds:schemaRefs>
+    <ds:schemaRef ds:uri="http://schemas.microsoft.com/sharepoint/v3/contenttype/forms"/>
+  </ds:schemaRefs>
+</ds:datastoreItem>
+</file>
+
+<file path=customXml/itemProps3.xml><?xml version="1.0" encoding="utf-8"?>
+<ds:datastoreItem xmlns:ds="http://schemas.openxmlformats.org/officeDocument/2006/customXml" ds:itemID="{50E1B932-765D-4A46-B44C-F60190630047}">
+  <ds:schemaRefs>
+    <ds:schemaRef ds:uri="http://schemas.openxmlformats.org/officeDocument/2006/bibliography"/>
+  </ds:schemaRefs>
+</ds:datastoreItem>
+</file>
+
+<file path=customXml/itemProps4.xml><?xml version="1.0" encoding="utf-8"?>
+<ds:datastoreItem xmlns:ds="http://schemas.openxmlformats.org/officeDocument/2006/customXml" ds:itemID="{B08EA9E8-3BB5-4A76-8042-864F008FC2FE}">
+  <ds:schemaRefs>
+    <ds:schemaRef ds:uri="http://schemas.microsoft.com/office/2006/metadata/properties"/>
+    <ds:schemaRef ds:uri="http://schemas.microsoft.com/office/infopath/2007/PartnerControls"/>
+    <ds:schemaRef ds:uri="eb2b4dc0-5538-4988-a426-1e3bf3687743"/>
+    <ds:schemaRef ds:uri="26488081-7094-48e3-a435-bbb366c5709a"/>
+  </ds:schemaRefs>
+</ds:datastoreItem>
 </file>
</xml_diff>